<commit_message>
actualizacion de promts en el archivo word
se implemento las modificaciones de del chat de la ai, las conversasiones para ponerla en el word
</commit_message>
<xml_diff>
--- a/Proyecto/documentacioProyecto/Promts.docx
+++ b/Proyecto/documentacioProyecto/Promts.docx
@@ -161,6 +161,9 @@
         <w:jc w:val="both"/>
       </w:pPr>
       <w:r>
+        <w:rPr>
+          <w:noProof/>
+        </w:rPr>
         <w:drawing>
           <wp:inline distT="0" distB="0" distL="0" distR="0" wp14:anchorId="40A9FB2D" wp14:editId="1F2B7B31">
             <wp:extent cx="3817620" cy="3115445"/>
@@ -177,7 +180,7 @@
                     <pic:cNvPicPr/>
                   </pic:nvPicPr>
                   <pic:blipFill>
-                    <a:blip r:embed="rId5"/>
+                    <a:blip r:embed="rId7"/>
                     <a:stretch>
                       <a:fillRect/>
                     </a:stretch>
@@ -358,6 +361,9 @@
         </w:rPr>
       </w:pPr>
       <w:r>
+        <w:rPr>
+          <w:noProof/>
+        </w:rPr>
         <w:drawing>
           <wp:anchor distT="0" distB="0" distL="114300" distR="114300" simplePos="0" relativeHeight="251659264" behindDoc="1" locked="0" layoutInCell="1" allowOverlap="1" wp14:anchorId="1562A735" wp14:editId="1B65CAEF">
             <wp:simplePos x="0" y="0"/>
@@ -390,7 +396,7 @@
                     <pic:cNvPicPr/>
                   </pic:nvPicPr>
                   <pic:blipFill>
-                    <a:blip r:embed="rId6">
+                    <a:blip r:embed="rId8">
                       <a:extLst>
                         <a:ext uri="{28A0092B-C50C-407E-A947-70E740481C1C}">
                           <a14:useLocalDpi xmlns:a14="http://schemas.microsoft.com/office/drawing/2010/main" val="0"/>
@@ -1252,6 +1258,7 @@
       <w:r>
         <w:rPr>
           <w:rFonts w:ascii="Times New Roman" w:eastAsia="Times New Roman" w:hAnsi="Times New Roman" w:cs="Times New Roman"/>
+          <w:noProof/>
           <w:kern w:val="0"/>
           <w:lang w:eastAsia="es-SV"/>
           <w14:ligatures w14:val="none"/>
@@ -1272,7 +1279,7 @@
                     <pic:cNvPicPr/>
                   </pic:nvPicPr>
                   <pic:blipFill>
-                    <a:blip r:embed="rId7"/>
+                    <a:blip r:embed="rId9"/>
                     <a:stretch>
                       <a:fillRect/>
                     </a:stretch>
@@ -3447,6 +3454,7 @@
       <w:r>
         <w:rPr>
           <w:rFonts w:ascii="Times New Roman" w:eastAsia="Times New Roman" w:hAnsi="Times New Roman" w:cs="Times New Roman"/>
+          <w:noProof/>
           <w:kern w:val="0"/>
           <w:lang w:eastAsia="es-SV"/>
           <w14:ligatures w14:val="none"/>
@@ -3483,7 +3491,7 @@
                     <pic:cNvPicPr/>
                   </pic:nvPicPr>
                   <pic:blipFill>
-                    <a:blip r:embed="rId8">
+                    <a:blip r:embed="rId10">
                       <a:extLst>
                         <a:ext uri="{28A0092B-C50C-407E-A947-70E740481C1C}">
                           <a14:useLocalDpi xmlns:a14="http://schemas.microsoft.com/office/drawing/2010/main" val="0"/>
@@ -3559,6 +3567,7 @@
       <w:r>
         <w:rPr>
           <w:rFonts w:ascii="Times New Roman" w:eastAsia="Times New Roman" w:hAnsi="Times New Roman" w:cs="Times New Roman"/>
+          <w:noProof/>
           <w:kern w:val="0"/>
           <w:lang w:eastAsia="es-SV"/>
           <w14:ligatures w14:val="none"/>
@@ -3595,7 +3604,7 @@
                     <pic:cNvPicPr/>
                   </pic:nvPicPr>
                   <pic:blipFill>
-                    <a:blip r:embed="rId9">
+                    <a:blip r:embed="rId11">
                       <a:extLst>
                         <a:ext uri="{28A0092B-C50C-407E-A947-70E740481C1C}">
                           <a14:useLocalDpi xmlns:a14="http://schemas.microsoft.com/office/drawing/2010/main" val="0"/>
@@ -3630,6 +3639,7 @@
       <w:r>
         <w:rPr>
           <w:rFonts w:ascii="Times New Roman" w:eastAsia="Times New Roman" w:hAnsi="Times New Roman" w:cs="Times New Roman"/>
+          <w:noProof/>
           <w:kern w:val="0"/>
           <w:lang w:eastAsia="es-SV"/>
           <w14:ligatures w14:val="none"/>
@@ -3666,7 +3676,7 @@
                     <pic:cNvPicPr/>
                   </pic:nvPicPr>
                   <pic:blipFill>
-                    <a:blip r:embed="rId10">
+                    <a:blip r:embed="rId12">
                       <a:extLst>
                         <a:ext uri="{28A0092B-C50C-407E-A947-70E740481C1C}">
                           <a14:useLocalDpi xmlns:a14="http://schemas.microsoft.com/office/drawing/2010/main" val="0"/>
@@ -4168,6 +4178,7 @@
       <w:r>
         <w:rPr>
           <w:rFonts w:ascii="Times New Roman" w:eastAsia="Times New Roman" w:hAnsi="Times New Roman" w:cs="Times New Roman"/>
+          <w:noProof/>
           <w:kern w:val="0"/>
           <w:lang w:eastAsia="es-SV"/>
           <w14:ligatures w14:val="none"/>
@@ -4205,7 +4216,7 @@
                     <pic:cNvPicPr/>
                   </pic:nvPicPr>
                   <pic:blipFill>
-                    <a:blip r:embed="rId11">
+                    <a:blip r:embed="rId13">
                       <a:extLst>
                         <a:ext uri="{28A0092B-C50C-407E-A947-70E740481C1C}">
                           <a14:useLocalDpi xmlns:a14="http://schemas.microsoft.com/office/drawing/2010/main" val="0"/>
@@ -4319,6 +4330,2814 @@
         <w:t xml:space="preserve"> Garantizó que el diseño no solo fuera comercialmente amplio sino técnicamente accesible y realista, optimizando el contraste para personas con capacidades visuales reducidas y arraigando el prototipo al contexto del mercado salvadoreño.</w:t>
       </w:r>
     </w:p>
+    <w:p>
+      <w:pPr>
+        <w:jc w:val="both"/>
+        <w:rPr>
+          <w:rFonts w:ascii="Times New Roman" w:eastAsia="Times New Roman" w:hAnsi="Times New Roman" w:cs="Times New Roman"/>
+          <w:lang w:eastAsia="es-SV"/>
+        </w:rPr>
+      </w:pPr>
+    </w:p>
+    <w:p>
+      <w:pPr>
+        <w:jc w:val="both"/>
+        <w:rPr>
+          <w:rFonts w:ascii="Times New Roman" w:eastAsia="Times New Roman" w:hAnsi="Times New Roman" w:cs="Times New Roman"/>
+          <w:lang w:eastAsia="es-SV"/>
+        </w:rPr>
+      </w:pPr>
+    </w:p>
+    <w:p>
+      <w:pPr>
+        <w:jc w:val="both"/>
+        <w:rPr>
+          <w:rFonts w:ascii="Times New Roman" w:eastAsia="Times New Roman" w:hAnsi="Times New Roman" w:cs="Times New Roman"/>
+          <w:lang w:eastAsia="es-SV"/>
+        </w:rPr>
+      </w:pPr>
+    </w:p>
+    <w:p>
+      <w:pPr>
+        <w:jc w:val="both"/>
+        <w:rPr>
+          <w:rFonts w:ascii="Times New Roman" w:eastAsia="Times New Roman" w:hAnsi="Times New Roman" w:cs="Times New Roman"/>
+          <w:lang w:eastAsia="es-SV"/>
+        </w:rPr>
+      </w:pPr>
+    </w:p>
+    <w:p>
+      <w:pPr>
+        <w:jc w:val="both"/>
+        <w:rPr>
+          <w:rFonts w:ascii="Times New Roman" w:eastAsia="Times New Roman" w:hAnsi="Times New Roman" w:cs="Times New Roman"/>
+          <w:lang w:eastAsia="es-SV"/>
+        </w:rPr>
+      </w:pPr>
+    </w:p>
+    <w:p>
+      <w:pPr>
+        <w:jc w:val="both"/>
+        <w:rPr>
+          <w:rFonts w:ascii="Times New Roman" w:eastAsia="Times New Roman" w:hAnsi="Times New Roman" w:cs="Times New Roman"/>
+          <w:lang w:eastAsia="es-SV"/>
+        </w:rPr>
+      </w:pPr>
+    </w:p>
+    <w:p>
+      <w:pPr>
+        <w:jc w:val="both"/>
+        <w:rPr>
+          <w:rFonts w:ascii="Times New Roman" w:eastAsia="Times New Roman" w:hAnsi="Times New Roman" w:cs="Times New Roman"/>
+          <w:lang w:eastAsia="es-SV"/>
+        </w:rPr>
+      </w:pPr>
+    </w:p>
+    <w:p>
+      <w:pPr>
+        <w:jc w:val="both"/>
+        <w:rPr>
+          <w:rFonts w:ascii="Times New Roman" w:eastAsia="Times New Roman" w:hAnsi="Times New Roman" w:cs="Times New Roman"/>
+          <w:lang w:eastAsia="es-SV"/>
+        </w:rPr>
+      </w:pPr>
+    </w:p>
+    <w:p>
+      <w:pPr>
+        <w:jc w:val="both"/>
+        <w:rPr>
+          <w:rFonts w:ascii="Times New Roman" w:eastAsia="Times New Roman" w:hAnsi="Times New Roman" w:cs="Times New Roman"/>
+          <w:lang w:eastAsia="es-SV"/>
+        </w:rPr>
+      </w:pPr>
+    </w:p>
+    <w:p>
+      <w:pPr>
+        <w:jc w:val="both"/>
+        <w:rPr>
+          <w:rFonts w:ascii="Times New Roman" w:eastAsia="Times New Roman" w:hAnsi="Times New Roman" w:cs="Times New Roman"/>
+          <w:lang w:eastAsia="es-SV"/>
+        </w:rPr>
+      </w:pPr>
+    </w:p>
+    <w:p>
+      <w:pPr>
+        <w:jc w:val="both"/>
+        <w:rPr>
+          <w:rFonts w:ascii="Times New Roman" w:eastAsia="Times New Roman" w:hAnsi="Times New Roman" w:cs="Times New Roman"/>
+          <w:lang w:eastAsia="es-SV"/>
+        </w:rPr>
+      </w:pPr>
+    </w:p>
+    <w:p>
+      <w:pPr>
+        <w:jc w:val="both"/>
+        <w:rPr>
+          <w:rFonts w:ascii="Times New Roman" w:eastAsia="Times New Roman" w:hAnsi="Times New Roman" w:cs="Times New Roman"/>
+          <w:lang w:eastAsia="es-SV"/>
+        </w:rPr>
+      </w:pPr>
+    </w:p>
+    <w:p>
+      <w:pPr>
+        <w:jc w:val="both"/>
+        <w:rPr>
+          <w:rFonts w:ascii="Times New Roman" w:eastAsia="Times New Roman" w:hAnsi="Times New Roman" w:cs="Times New Roman"/>
+          <w:lang w:eastAsia="es-SV"/>
+        </w:rPr>
+      </w:pPr>
+    </w:p>
+    <w:p>
+      <w:pPr>
+        <w:jc w:val="both"/>
+        <w:rPr>
+          <w:rFonts w:ascii="Times New Roman" w:eastAsia="Times New Roman" w:hAnsi="Times New Roman" w:cs="Times New Roman"/>
+          <w:lang w:eastAsia="es-SV"/>
+        </w:rPr>
+      </w:pPr>
+    </w:p>
+    <w:p>
+      <w:pPr>
+        <w:jc w:val="both"/>
+        <w:rPr>
+          <w:rFonts w:ascii="Times New Roman" w:eastAsia="Times New Roman" w:hAnsi="Times New Roman" w:cs="Times New Roman"/>
+          <w:lang w:eastAsia="es-SV"/>
+        </w:rPr>
+      </w:pPr>
+    </w:p>
+    <w:p>
+      <w:pPr>
+        <w:jc w:val="both"/>
+        <w:rPr>
+          <w:rFonts w:ascii="Times New Roman" w:eastAsia="Times New Roman" w:hAnsi="Times New Roman" w:cs="Times New Roman"/>
+          <w:lang w:eastAsia="es-SV"/>
+        </w:rPr>
+      </w:pPr>
+    </w:p>
+    <w:p>
+      <w:pPr>
+        <w:jc w:val="both"/>
+        <w:rPr>
+          <w:rFonts w:ascii="Times New Roman" w:eastAsia="Times New Roman" w:hAnsi="Times New Roman" w:cs="Times New Roman"/>
+          <w:lang w:eastAsia="es-SV"/>
+        </w:rPr>
+      </w:pPr>
+    </w:p>
+    <w:p>
+      <w:pPr>
+        <w:jc w:val="both"/>
+        <w:rPr>
+          <w:rFonts w:ascii="Times New Roman" w:eastAsia="Times New Roman" w:hAnsi="Times New Roman" w:cs="Times New Roman"/>
+          <w:b/>
+          <w:bCs/>
+          <w:lang w:eastAsia="es-SV"/>
+        </w:rPr>
+      </w:pPr>
+      <w:proofErr w:type="spellStart"/>
+      <w:r>
+        <w:rPr>
+          <w:rFonts w:ascii="Times New Roman" w:eastAsia="Times New Roman" w:hAnsi="Times New Roman" w:cs="Times New Roman"/>
+          <w:b/>
+          <w:bCs/>
+          <w:lang w:eastAsia="es-SV"/>
+        </w:rPr>
+        <w:lastRenderedPageBreak/>
+        <w:t>Codigo</w:t>
+      </w:r>
+      <w:proofErr w:type="spellEnd"/>
+    </w:p>
+    <w:p>
+      <w:pPr>
+        <w:jc w:val="both"/>
+        <w:rPr>
+          <w:rFonts w:ascii="Times New Roman" w:eastAsia="Times New Roman" w:hAnsi="Times New Roman" w:cs="Times New Roman"/>
+          <w:lang w:eastAsia="es-SV"/>
+        </w:rPr>
+      </w:pPr>
+    </w:p>
+    <w:p>
+      <w:pPr>
+        <w:jc w:val="both"/>
+        <w:rPr>
+          <w:rFonts w:ascii="Times New Roman" w:eastAsia="Times New Roman" w:hAnsi="Times New Roman" w:cs="Times New Roman"/>
+          <w:lang w:eastAsia="es-SV"/>
+        </w:rPr>
+      </w:pPr>
+      <w:r>
+        <w:rPr>
+          <w:rFonts w:ascii="Times New Roman" w:eastAsia="Times New Roman" w:hAnsi="Times New Roman" w:cs="Times New Roman"/>
+          <w:lang w:eastAsia="es-SV"/>
+        </w:rPr>
+        <w:t>Hey, una pregunta: ¿Por qué pusiste ese "</w:t>
+      </w:r>
+      <w:proofErr w:type="spellStart"/>
+      <w:r>
+        <w:rPr>
+          <w:rFonts w:ascii="Times New Roman" w:eastAsia="Times New Roman" w:hAnsi="Times New Roman" w:cs="Times New Roman"/>
+          <w:lang w:eastAsia="es-SV"/>
+        </w:rPr>
+        <w:t>backdrop-filter</w:t>
+      </w:r>
+      <w:proofErr w:type="spellEnd"/>
+      <w:r>
+        <w:rPr>
+          <w:rFonts w:ascii="Times New Roman" w:eastAsia="Times New Roman" w:hAnsi="Times New Roman" w:cs="Times New Roman"/>
+          <w:lang w:eastAsia="es-SV"/>
+        </w:rPr>
+        <w:t xml:space="preserve">: </w:t>
+      </w:r>
+      <w:proofErr w:type="spellStart"/>
+      <w:r>
+        <w:rPr>
+          <w:rFonts w:ascii="Times New Roman" w:eastAsia="Times New Roman" w:hAnsi="Times New Roman" w:cs="Times New Roman"/>
+          <w:lang w:eastAsia="es-SV"/>
+        </w:rPr>
+        <w:t>blur</w:t>
+      </w:r>
+      <w:proofErr w:type="spellEnd"/>
+      <w:r>
+        <w:rPr>
+          <w:rFonts w:ascii="Times New Roman" w:eastAsia="Times New Roman" w:hAnsi="Times New Roman" w:cs="Times New Roman"/>
+          <w:lang w:eastAsia="es-SV"/>
+        </w:rPr>
+        <w:t xml:space="preserve">(8px)" en la cabecera? Explícame bien cómo funciona eso del </w:t>
+      </w:r>
+      <w:proofErr w:type="spellStart"/>
+      <w:r>
+        <w:rPr>
+          <w:rFonts w:ascii="Times New Roman" w:eastAsia="Times New Roman" w:hAnsi="Times New Roman" w:cs="Times New Roman"/>
+          <w:lang w:eastAsia="es-SV"/>
+        </w:rPr>
+        <w:t>blur</w:t>
+      </w:r>
+      <w:proofErr w:type="spellEnd"/>
+      <w:r>
+        <w:rPr>
+          <w:rFonts w:ascii="Times New Roman" w:eastAsia="Times New Roman" w:hAnsi="Times New Roman" w:cs="Times New Roman"/>
+          <w:lang w:eastAsia="es-SV"/>
+        </w:rPr>
+        <w:t xml:space="preserve"> y las variables con la curva de animación en </w:t>
+      </w:r>
+      <w:proofErr w:type="gramStart"/>
+      <w:r>
+        <w:rPr>
+          <w:rFonts w:ascii="Times New Roman" w:eastAsia="Times New Roman" w:hAnsi="Times New Roman" w:cs="Times New Roman"/>
+          <w:lang w:eastAsia="es-SV"/>
+        </w:rPr>
+        <w:t>el :</w:t>
+      </w:r>
+      <w:proofErr w:type="spellStart"/>
+      <w:r>
+        <w:rPr>
+          <w:rFonts w:ascii="Times New Roman" w:eastAsia="Times New Roman" w:hAnsi="Times New Roman" w:cs="Times New Roman"/>
+          <w:lang w:eastAsia="es-SV"/>
+        </w:rPr>
+        <w:t>root</w:t>
+      </w:r>
+      <w:proofErr w:type="spellEnd"/>
+      <w:proofErr w:type="gramEnd"/>
+      <w:r>
+        <w:rPr>
+          <w:rFonts w:ascii="Times New Roman" w:eastAsia="Times New Roman" w:hAnsi="Times New Roman" w:cs="Times New Roman"/>
+          <w:lang w:eastAsia="es-SV"/>
+        </w:rPr>
+        <w:t>, porque quiero entender bien por qué el diseño se ve tan fluido y premium.</w:t>
+      </w:r>
+    </w:p>
+    <w:p>
+      <w:pPr>
+        <w:jc w:val="both"/>
+        <w:rPr>
+          <w:rFonts w:ascii="Times New Roman" w:eastAsia="Times New Roman" w:hAnsi="Times New Roman" w:cs="Times New Roman"/>
+          <w:lang w:eastAsia="es-SV"/>
+        </w:rPr>
+      </w:pPr>
+      <w:r>
+        <w:rPr>
+          <w:rFonts w:ascii="Times New Roman" w:eastAsia="Times New Roman" w:hAnsi="Times New Roman" w:cs="Times New Roman"/>
+          <w:lang w:eastAsia="es-SV"/>
+        </w:rPr>
+        <w:t xml:space="preserve">• </w:t>
+      </w:r>
+      <w:r>
+        <w:rPr>
+          <w:rFonts w:ascii="Times New Roman" w:eastAsia="Times New Roman" w:hAnsi="Times New Roman" w:cs="Times New Roman"/>
+          <w:b/>
+          <w:bCs/>
+          <w:lang w:eastAsia="es-SV"/>
+        </w:rPr>
+        <w:t>Respuesta generada por la IA:</w:t>
+      </w:r>
+      <w:r>
+        <w:rPr>
+          <w:rFonts w:ascii="Times New Roman" w:eastAsia="Times New Roman" w:hAnsi="Times New Roman" w:cs="Times New Roman"/>
+          <w:lang w:eastAsia="es-SV"/>
+        </w:rPr>
+        <w:t xml:space="preserve"> Explicación técnica y conceptual sobre las propiedades de renderizado de última generación en CSS:</w:t>
+      </w:r>
+    </w:p>
+    <w:p>
+      <w:pPr>
+        <w:numPr>
+          <w:ilvl w:val="0"/>
+          <w:numId w:val="13"/>
+        </w:numPr>
+        <w:jc w:val="both"/>
+        <w:rPr>
+          <w:rFonts w:ascii="Times New Roman" w:eastAsia="Times New Roman" w:hAnsi="Times New Roman" w:cs="Times New Roman"/>
+          <w:lang w:eastAsia="es-SV"/>
+        </w:rPr>
+      </w:pPr>
+      <w:r>
+        <w:rPr>
+          <w:rFonts w:ascii="Times New Roman" w:eastAsia="Times New Roman" w:hAnsi="Times New Roman" w:cs="Times New Roman"/>
+          <w:b/>
+          <w:bCs/>
+          <w:lang w:eastAsia="es-SV"/>
+        </w:rPr>
+        <w:t xml:space="preserve">Efecto </w:t>
+      </w:r>
+      <w:proofErr w:type="spellStart"/>
+      <w:r>
+        <w:rPr>
+          <w:rFonts w:ascii="Times New Roman" w:eastAsia="Times New Roman" w:hAnsi="Times New Roman" w:cs="Times New Roman"/>
+          <w:b/>
+          <w:bCs/>
+          <w:lang w:eastAsia="es-SV"/>
+        </w:rPr>
+        <w:t>Backdrop</w:t>
+      </w:r>
+      <w:proofErr w:type="spellEnd"/>
+      <w:r>
+        <w:rPr>
+          <w:rFonts w:ascii="Times New Roman" w:eastAsia="Times New Roman" w:hAnsi="Times New Roman" w:cs="Times New Roman"/>
+          <w:b/>
+          <w:bCs/>
+          <w:lang w:eastAsia="es-SV"/>
+        </w:rPr>
+        <w:t>-Filter:</w:t>
+      </w:r>
+      <w:r>
+        <w:rPr>
+          <w:rFonts w:ascii="Times New Roman" w:eastAsia="Times New Roman" w:hAnsi="Times New Roman" w:cs="Times New Roman"/>
+          <w:lang w:eastAsia="es-SV"/>
+        </w:rPr>
+        <w:t xml:space="preserve"> Se aclaró que, a diferencia de un </w:t>
+      </w:r>
+      <w:proofErr w:type="spellStart"/>
+      <w:r>
+        <w:rPr>
+          <w:rFonts w:ascii="Times New Roman" w:eastAsia="Times New Roman" w:hAnsi="Times New Roman" w:cs="Times New Roman"/>
+          <w:lang w:eastAsia="es-SV"/>
+        </w:rPr>
+        <w:t>opacity</w:t>
+      </w:r>
+      <w:proofErr w:type="spellEnd"/>
+      <w:r>
+        <w:rPr>
+          <w:rFonts w:ascii="Times New Roman" w:eastAsia="Times New Roman" w:hAnsi="Times New Roman" w:cs="Times New Roman"/>
+          <w:lang w:eastAsia="es-SV"/>
+        </w:rPr>
+        <w:t xml:space="preserve"> tradicional que vuelve transparente todo el elemento (incluyendo el texto y los logotipos), </w:t>
+      </w:r>
+      <w:proofErr w:type="spellStart"/>
+      <w:r>
+        <w:rPr>
+          <w:rFonts w:ascii="Times New Roman" w:eastAsia="Times New Roman" w:hAnsi="Times New Roman" w:cs="Times New Roman"/>
+          <w:lang w:eastAsia="es-SV"/>
+        </w:rPr>
+        <w:t>backdrop-filter</w:t>
+      </w:r>
+      <w:proofErr w:type="spellEnd"/>
+      <w:r>
+        <w:rPr>
+          <w:rFonts w:ascii="Times New Roman" w:eastAsia="Times New Roman" w:hAnsi="Times New Roman" w:cs="Times New Roman"/>
+          <w:lang w:eastAsia="es-SV"/>
+        </w:rPr>
+        <w:t xml:space="preserve">: </w:t>
+      </w:r>
+      <w:proofErr w:type="spellStart"/>
+      <w:r>
+        <w:rPr>
+          <w:rFonts w:ascii="Times New Roman" w:eastAsia="Times New Roman" w:hAnsi="Times New Roman" w:cs="Times New Roman"/>
+          <w:lang w:eastAsia="es-SV"/>
+        </w:rPr>
+        <w:t>blur</w:t>
+      </w:r>
+      <w:proofErr w:type="spellEnd"/>
+      <w:r>
+        <w:rPr>
+          <w:rFonts w:ascii="Times New Roman" w:eastAsia="Times New Roman" w:hAnsi="Times New Roman" w:cs="Times New Roman"/>
+          <w:lang w:eastAsia="es-SV"/>
+        </w:rPr>
+        <w:t xml:space="preserve">(8px) aplica un desenfoque directamente a los elementos que quedan </w:t>
+      </w:r>
+      <w:r>
+        <w:rPr>
+          <w:rFonts w:ascii="Times New Roman" w:eastAsia="Times New Roman" w:hAnsi="Times New Roman" w:cs="Times New Roman"/>
+          <w:i/>
+          <w:iCs/>
+          <w:lang w:eastAsia="es-SV"/>
+        </w:rPr>
+        <w:t>detrás</w:t>
+      </w:r>
+      <w:r>
+        <w:rPr>
+          <w:rFonts w:ascii="Times New Roman" w:eastAsia="Times New Roman" w:hAnsi="Times New Roman" w:cs="Times New Roman"/>
+          <w:lang w:eastAsia="es-SV"/>
+        </w:rPr>
+        <w:t xml:space="preserve"> de la cabecera (como las imágenes del Hero o el catálogo al hacer </w:t>
+      </w:r>
+      <w:proofErr w:type="spellStart"/>
+      <w:r>
+        <w:rPr>
+          <w:rFonts w:ascii="Times New Roman" w:eastAsia="Times New Roman" w:hAnsi="Times New Roman" w:cs="Times New Roman"/>
+          <w:lang w:eastAsia="es-SV"/>
+        </w:rPr>
+        <w:t>scroll</w:t>
+      </w:r>
+      <w:proofErr w:type="spellEnd"/>
+      <w:r>
+        <w:rPr>
+          <w:rFonts w:ascii="Times New Roman" w:eastAsia="Times New Roman" w:hAnsi="Times New Roman" w:cs="Times New Roman"/>
+          <w:lang w:eastAsia="es-SV"/>
+        </w:rPr>
+        <w:t>), logrando un efecto de "vidrio esmerilado" (</w:t>
+      </w:r>
+      <w:proofErr w:type="spellStart"/>
+      <w:r>
+        <w:rPr>
+          <w:rFonts w:ascii="Times New Roman" w:eastAsia="Times New Roman" w:hAnsi="Times New Roman" w:cs="Times New Roman"/>
+          <w:lang w:eastAsia="es-SV"/>
+        </w:rPr>
+        <w:t>Glassmorphism</w:t>
+      </w:r>
+      <w:proofErr w:type="spellEnd"/>
+      <w:r>
+        <w:rPr>
+          <w:rFonts w:ascii="Times New Roman" w:eastAsia="Times New Roman" w:hAnsi="Times New Roman" w:cs="Times New Roman"/>
+          <w:lang w:eastAsia="es-SV"/>
+        </w:rPr>
+        <w:t>) de alta gama.</w:t>
+      </w:r>
+    </w:p>
+    <w:p>
+      <w:pPr>
+        <w:numPr>
+          <w:ilvl w:val="0"/>
+          <w:numId w:val="13"/>
+        </w:numPr>
+        <w:jc w:val="both"/>
+        <w:rPr>
+          <w:rFonts w:ascii="Times New Roman" w:eastAsia="Times New Roman" w:hAnsi="Times New Roman" w:cs="Times New Roman"/>
+          <w:lang w:eastAsia="es-SV"/>
+        </w:rPr>
+      </w:pPr>
+      <w:r>
+        <w:rPr>
+          <w:rFonts w:ascii="Times New Roman" w:eastAsia="Times New Roman" w:hAnsi="Times New Roman" w:cs="Times New Roman"/>
+          <w:b/>
+          <w:bCs/>
+          <w:lang w:eastAsia="es-SV"/>
+        </w:rPr>
+        <w:t>Dinámica del Cubic-</w:t>
+      </w:r>
+      <w:proofErr w:type="spellStart"/>
+      <w:r>
+        <w:rPr>
+          <w:rFonts w:ascii="Times New Roman" w:eastAsia="Times New Roman" w:hAnsi="Times New Roman" w:cs="Times New Roman"/>
+          <w:b/>
+          <w:bCs/>
+          <w:lang w:eastAsia="es-SV"/>
+        </w:rPr>
+        <w:t>Bezier</w:t>
+      </w:r>
+      <w:proofErr w:type="spellEnd"/>
+      <w:r>
+        <w:rPr>
+          <w:rFonts w:ascii="Times New Roman" w:eastAsia="Times New Roman" w:hAnsi="Times New Roman" w:cs="Times New Roman"/>
+          <w:b/>
+          <w:bCs/>
+          <w:lang w:eastAsia="es-SV"/>
+        </w:rPr>
+        <w:t>:</w:t>
+      </w:r>
+      <w:r>
+        <w:rPr>
+          <w:rFonts w:ascii="Times New Roman" w:eastAsia="Times New Roman" w:hAnsi="Times New Roman" w:cs="Times New Roman"/>
+          <w:lang w:eastAsia="es-SV"/>
+        </w:rPr>
+        <w:t xml:space="preserve"> Explicación de la variable --curva-</w:t>
+      </w:r>
+      <w:proofErr w:type="spellStart"/>
+      <w:r>
+        <w:rPr>
+          <w:rFonts w:ascii="Times New Roman" w:eastAsia="Times New Roman" w:hAnsi="Times New Roman" w:cs="Times New Roman"/>
+          <w:lang w:eastAsia="es-SV"/>
+        </w:rPr>
+        <w:t>animacion</w:t>
+      </w:r>
+      <w:proofErr w:type="spellEnd"/>
+      <w:r>
+        <w:rPr>
+          <w:rFonts w:ascii="Times New Roman" w:eastAsia="Times New Roman" w:hAnsi="Times New Roman" w:cs="Times New Roman"/>
+          <w:lang w:eastAsia="es-SV"/>
+        </w:rPr>
+        <w:t xml:space="preserve">: </w:t>
+      </w:r>
+      <w:proofErr w:type="spellStart"/>
+      <w:r>
+        <w:rPr>
+          <w:rFonts w:ascii="Times New Roman" w:eastAsia="Times New Roman" w:hAnsi="Times New Roman" w:cs="Times New Roman"/>
+          <w:lang w:eastAsia="es-SV"/>
+        </w:rPr>
+        <w:t>cubic-</w:t>
+      </w:r>
+      <w:proofErr w:type="gramStart"/>
+      <w:r>
+        <w:rPr>
+          <w:rFonts w:ascii="Times New Roman" w:eastAsia="Times New Roman" w:hAnsi="Times New Roman" w:cs="Times New Roman"/>
+          <w:lang w:eastAsia="es-SV"/>
+        </w:rPr>
+        <w:t>bezier</w:t>
+      </w:r>
+      <w:proofErr w:type="spellEnd"/>
+      <w:r>
+        <w:rPr>
+          <w:rFonts w:ascii="Times New Roman" w:eastAsia="Times New Roman" w:hAnsi="Times New Roman" w:cs="Times New Roman"/>
+          <w:lang w:eastAsia="es-SV"/>
+        </w:rPr>
+        <w:t>(</w:t>
+      </w:r>
+      <w:proofErr w:type="gramEnd"/>
+      <w:r>
+        <w:rPr>
+          <w:rFonts w:ascii="Times New Roman" w:eastAsia="Times New Roman" w:hAnsi="Times New Roman" w:cs="Times New Roman"/>
+          <w:lang w:eastAsia="es-SV"/>
+        </w:rPr>
+        <w:t xml:space="preserve">0.2, 0.8, 0.2, 1). Se detalló </w:t>
+      </w:r>
+      <w:proofErr w:type="gramStart"/>
+      <w:r>
+        <w:rPr>
+          <w:rFonts w:ascii="Times New Roman" w:eastAsia="Times New Roman" w:hAnsi="Times New Roman" w:cs="Times New Roman"/>
+          <w:lang w:eastAsia="es-SV"/>
+        </w:rPr>
+        <w:t>que</w:t>
+      </w:r>
+      <w:proofErr w:type="gramEnd"/>
+      <w:r>
+        <w:rPr>
+          <w:rFonts w:ascii="Times New Roman" w:eastAsia="Times New Roman" w:hAnsi="Times New Roman" w:cs="Times New Roman"/>
+          <w:lang w:eastAsia="es-SV"/>
+        </w:rPr>
+        <w:t xml:space="preserve"> en lugar de una transición lineal y aburrida, esta curva matemática emula la física del mundo real: inicia el movimiento de forma extremadamente rápida y lo frena suavemente al final, lo que genera esa percepción de fluidez corporativa en los botones y tarjetas.</w:t>
+      </w:r>
+    </w:p>
+    <w:p>
+      <w:pPr>
+        <w:jc w:val="both"/>
+        <w:rPr>
+          <w:rFonts w:ascii="Times New Roman" w:eastAsia="Times New Roman" w:hAnsi="Times New Roman" w:cs="Times New Roman"/>
+          <w:lang w:eastAsia="es-SV"/>
+        </w:rPr>
+      </w:pPr>
+      <w:r>
+        <w:rPr>
+          <w:rFonts w:ascii="Times New Roman" w:eastAsia="Times New Roman" w:hAnsi="Times New Roman" w:cs="Times New Roman"/>
+          <w:lang w:eastAsia="es-SV"/>
+        </w:rPr>
+        <w:drawing>
+          <wp:inline distT="0" distB="0" distL="0" distR="0" wp14:anchorId="79354E71" wp14:editId="290D1626">
+            <wp:extent cx="5612130" cy="1480185"/>
+            <wp:effectExtent l="0" t="0" r="7620" b="5715"/>
+            <wp:docPr id="350373852" name="Imagen 1"/>
+            <wp:cNvGraphicFramePr>
+              <a:graphicFrameLocks xmlns:a="http://schemas.openxmlformats.org/drawingml/2006/main" noChangeAspect="1"/>
+            </wp:cNvGraphicFramePr>
+            <a:graphic xmlns:a="http://schemas.openxmlformats.org/drawingml/2006/main">
+              <a:graphicData uri="http://schemas.openxmlformats.org/drawingml/2006/picture">
+                <pic:pic xmlns:pic="http://schemas.openxmlformats.org/drawingml/2006/picture">
+                  <pic:nvPicPr>
+                    <pic:cNvPr id="350373852" name=""/>
+                    <pic:cNvPicPr/>
+                  </pic:nvPicPr>
+                  <pic:blipFill>
+                    <a:blip r:embed="rId14"/>
+                    <a:stretch>
+                      <a:fillRect/>
+                    </a:stretch>
+                  </pic:blipFill>
+                  <pic:spPr>
+                    <a:xfrm>
+                      <a:off x="0" y="0"/>
+                      <a:ext cx="5612130" cy="1480185"/>
+                    </a:xfrm>
+                    <a:prstGeom prst="rect">
+                      <a:avLst/>
+                    </a:prstGeom>
+                  </pic:spPr>
+                </pic:pic>
+              </a:graphicData>
+            </a:graphic>
+          </wp:inline>
+        </w:drawing>
+      </w:r>
+    </w:p>
+    <w:p>
+      <w:pPr>
+        <w:jc w:val="both"/>
+        <w:rPr>
+          <w:rFonts w:ascii="Times New Roman" w:eastAsia="Times New Roman" w:hAnsi="Times New Roman" w:cs="Times New Roman"/>
+          <w:lang w:eastAsia="es-SV"/>
+        </w:rPr>
+      </w:pPr>
+    </w:p>
+    <w:p>
+      <w:pPr>
+        <w:jc w:val="both"/>
+        <w:rPr>
+          <w:rFonts w:ascii="Times New Roman" w:eastAsia="Times New Roman" w:hAnsi="Times New Roman" w:cs="Times New Roman"/>
+          <w:lang w:eastAsia="es-SV"/>
+        </w:rPr>
+      </w:pPr>
+      <w:r>
+        <w:rPr>
+          <w:rFonts w:ascii="Times New Roman" w:eastAsia="Times New Roman" w:hAnsi="Times New Roman" w:cs="Times New Roman"/>
+          <w:lang w:eastAsia="es-SV"/>
+        </w:rPr>
+        <w:t xml:space="preserve">• </w:t>
+      </w:r>
+      <w:r>
+        <w:rPr>
+          <w:rFonts w:ascii="Times New Roman" w:eastAsia="Times New Roman" w:hAnsi="Times New Roman" w:cs="Times New Roman"/>
+          <w:b/>
+          <w:bCs/>
+          <w:lang w:eastAsia="es-SV"/>
+        </w:rPr>
+        <w:t>Resultado aplicado o adaptado en el proyecto:</w:t>
+      </w:r>
+      <w:r>
+        <w:rPr>
+          <w:rFonts w:ascii="Times New Roman" w:eastAsia="Times New Roman" w:hAnsi="Times New Roman" w:cs="Times New Roman"/>
+          <w:lang w:eastAsia="es-SV"/>
+        </w:rPr>
+        <w:t xml:space="preserve"> Comprensión e integración total de los efectos avanzados de CSS en el prototipo. Se validó que la cabecera mantuviera la legibilidad de los enlaces de navegación sin importar el color de las imágenes que pasaran por debajo durante el </w:t>
+      </w:r>
+      <w:proofErr w:type="spellStart"/>
+      <w:r>
+        <w:rPr>
+          <w:rFonts w:ascii="Times New Roman" w:eastAsia="Times New Roman" w:hAnsi="Times New Roman" w:cs="Times New Roman"/>
+          <w:lang w:eastAsia="es-SV"/>
+        </w:rPr>
+        <w:t>scroll</w:t>
+      </w:r>
+      <w:proofErr w:type="spellEnd"/>
+      <w:r>
+        <w:rPr>
+          <w:rFonts w:ascii="Times New Roman" w:eastAsia="Times New Roman" w:hAnsi="Times New Roman" w:cs="Times New Roman"/>
+          <w:lang w:eastAsia="es-SV"/>
+        </w:rPr>
+        <w:t xml:space="preserve">, y se unificó el tiempo de respuesta de todos los </w:t>
+      </w:r>
+      <w:proofErr w:type="gramStart"/>
+      <w:r>
+        <w:rPr>
+          <w:rFonts w:ascii="Times New Roman" w:eastAsia="Times New Roman" w:hAnsi="Times New Roman" w:cs="Times New Roman"/>
+          <w:lang w:eastAsia="es-SV"/>
+        </w:rPr>
+        <w:t>estados :</w:t>
+      </w:r>
+      <w:proofErr w:type="spellStart"/>
+      <w:r>
+        <w:rPr>
+          <w:rFonts w:ascii="Times New Roman" w:eastAsia="Times New Roman" w:hAnsi="Times New Roman" w:cs="Times New Roman"/>
+          <w:lang w:eastAsia="es-SV"/>
+        </w:rPr>
+        <w:t>hover</w:t>
+      </w:r>
+      <w:proofErr w:type="spellEnd"/>
+      <w:proofErr w:type="gramEnd"/>
+      <w:r>
+        <w:rPr>
+          <w:rFonts w:ascii="Times New Roman" w:eastAsia="Times New Roman" w:hAnsi="Times New Roman" w:cs="Times New Roman"/>
+          <w:lang w:eastAsia="es-SV"/>
+        </w:rPr>
+        <w:t xml:space="preserve"> a 0.35s para mantener la armonía visual.</w:t>
+      </w:r>
+    </w:p>
+    <w:p>
+      <w:pPr>
+        <w:jc w:val="both"/>
+        <w:rPr>
+          <w:rFonts w:ascii="Times New Roman" w:eastAsia="Times New Roman" w:hAnsi="Times New Roman" w:cs="Times New Roman"/>
+          <w:lang w:eastAsia="es-SV"/>
+        </w:rPr>
+      </w:pPr>
+      <w:r>
+        <w:rPr>
+          <w:rFonts w:ascii="Times New Roman" w:eastAsia="Times New Roman" w:hAnsi="Times New Roman" w:cs="Times New Roman"/>
+          <w:lang w:eastAsia="es-SV"/>
+        </w:rPr>
+        <w:t xml:space="preserve">• </w:t>
+      </w:r>
+      <w:r>
+        <w:rPr>
+          <w:rFonts w:ascii="Times New Roman" w:eastAsia="Times New Roman" w:hAnsi="Times New Roman" w:cs="Times New Roman"/>
+          <w:b/>
+          <w:bCs/>
+          <w:lang w:eastAsia="es-SV"/>
+        </w:rPr>
+        <w:t>Explicación breve del aporte de la IA en el proceso de desarrollo:</w:t>
+      </w:r>
+      <w:r>
+        <w:rPr>
+          <w:rFonts w:ascii="Times New Roman" w:eastAsia="Times New Roman" w:hAnsi="Times New Roman" w:cs="Times New Roman"/>
+          <w:lang w:eastAsia="es-SV"/>
+        </w:rPr>
+        <w:t xml:space="preserve"> Funcionó como un consultor técnico personalizado, traduciendo conceptos avanzados de CSS a un lenguaje claro y práctico. Esto evitó que el código se copiara a ciegas, permitiendo entender la lógica detrás del rendimiento de las animaciones y el diseño de interfaces modernas.</w:t>
+      </w:r>
+    </w:p>
+    <w:p>
+      <w:pPr>
+        <w:jc w:val="both"/>
+        <w:rPr>
+          <w:rFonts w:ascii="Times New Roman" w:eastAsia="Times New Roman" w:hAnsi="Times New Roman" w:cs="Times New Roman"/>
+          <w:lang w:eastAsia="es-SV"/>
+        </w:rPr>
+      </w:pPr>
+    </w:p>
+    <w:p>
+      <w:pPr>
+        <w:jc w:val="both"/>
+        <w:rPr>
+          <w:rFonts w:ascii="Times New Roman" w:eastAsia="Times New Roman" w:hAnsi="Times New Roman" w:cs="Times New Roman"/>
+          <w:b/>
+          <w:bCs/>
+          <w:lang w:eastAsia="es-SV"/>
+        </w:rPr>
+      </w:pPr>
+      <w:r>
+        <w:rPr>
+          <w:rFonts w:ascii="Times New Roman" w:eastAsia="Times New Roman" w:hAnsi="Times New Roman" w:cs="Times New Roman"/>
+          <w:b/>
+          <w:bCs/>
+          <w:lang w:eastAsia="es-SV"/>
+        </w:rPr>
+        <w:lastRenderedPageBreak/>
+        <w:t xml:space="preserve"> RESOLUCIÓN DE DUDAS EN DISEÑOS ASIMÉTRICOS (CARRITO DE COMPRAS)</w:t>
+      </w:r>
+    </w:p>
+    <w:p>
+      <w:pPr>
+        <w:jc w:val="both"/>
+        <w:rPr>
+          <w:rFonts w:ascii="Times New Roman" w:eastAsia="Times New Roman" w:hAnsi="Times New Roman" w:cs="Times New Roman"/>
+          <w:lang w:eastAsia="es-SV"/>
+        </w:rPr>
+      </w:pPr>
+      <w:r>
+        <w:rPr>
+          <w:rFonts w:ascii="Times New Roman" w:eastAsia="Times New Roman" w:hAnsi="Times New Roman" w:cs="Times New Roman"/>
+          <w:lang w:eastAsia="es-SV"/>
+        </w:rPr>
+        <w:t xml:space="preserve">• </w:t>
+      </w:r>
+      <w:proofErr w:type="spellStart"/>
+      <w:r>
+        <w:rPr>
+          <w:rFonts w:ascii="Times New Roman" w:eastAsia="Times New Roman" w:hAnsi="Times New Roman" w:cs="Times New Roman"/>
+          <w:b/>
+          <w:bCs/>
+          <w:lang w:eastAsia="es-SV"/>
+        </w:rPr>
+        <w:t>Prompt</w:t>
+      </w:r>
+      <w:proofErr w:type="spellEnd"/>
+      <w:r>
+        <w:rPr>
+          <w:rFonts w:ascii="Times New Roman" w:eastAsia="Times New Roman" w:hAnsi="Times New Roman" w:cs="Times New Roman"/>
+          <w:b/>
+          <w:bCs/>
+          <w:lang w:eastAsia="es-SV"/>
+        </w:rPr>
+        <w:t xml:space="preserve"> utilizado:</w:t>
+      </w:r>
+    </w:p>
+    <w:p>
+      <w:pPr>
+        <w:jc w:val="both"/>
+        <w:rPr>
+          <w:rFonts w:ascii="Times New Roman" w:eastAsia="Times New Roman" w:hAnsi="Times New Roman" w:cs="Times New Roman"/>
+          <w:lang w:eastAsia="es-SV"/>
+        </w:rPr>
+      </w:pPr>
+      <w:r>
+        <w:rPr>
+          <w:rFonts w:ascii="Times New Roman" w:eastAsia="Times New Roman" w:hAnsi="Times New Roman" w:cs="Times New Roman"/>
+          <w:lang w:eastAsia="es-SV"/>
+        </w:rPr>
+        <w:t xml:space="preserve">Mira, no entiendo bien la parte del carrito. Explícame cómo </w:t>
+      </w:r>
+      <w:proofErr w:type="spellStart"/>
+      <w:r>
+        <w:rPr>
+          <w:rFonts w:ascii="Times New Roman" w:eastAsia="Times New Roman" w:hAnsi="Times New Roman" w:cs="Times New Roman"/>
+          <w:lang w:eastAsia="es-SV"/>
+        </w:rPr>
+        <w:t>hacés</w:t>
+      </w:r>
+      <w:proofErr w:type="spellEnd"/>
+      <w:r>
+        <w:rPr>
+          <w:rFonts w:ascii="Times New Roman" w:eastAsia="Times New Roman" w:hAnsi="Times New Roman" w:cs="Times New Roman"/>
+          <w:lang w:eastAsia="es-SV"/>
+        </w:rPr>
+        <w:t xml:space="preserve"> para que la caja del resumen de pago se quede fija a un lado cuando bajas en la página y por qué usaste ese </w:t>
+      </w:r>
+      <w:proofErr w:type="spellStart"/>
+      <w:r>
+        <w:rPr>
+          <w:rFonts w:ascii="Times New Roman" w:eastAsia="Times New Roman" w:hAnsi="Times New Roman" w:cs="Times New Roman"/>
+          <w:lang w:eastAsia="es-SV"/>
+        </w:rPr>
+        <w:t>grid</w:t>
+      </w:r>
+      <w:proofErr w:type="spellEnd"/>
+      <w:r>
+        <w:rPr>
+          <w:rFonts w:ascii="Times New Roman" w:eastAsia="Times New Roman" w:hAnsi="Times New Roman" w:cs="Times New Roman"/>
+          <w:lang w:eastAsia="es-SV"/>
+        </w:rPr>
+        <w:t xml:space="preserve"> de "1fr 350px". ¿Eso no va a romper el diseño en teléfonos?</w:t>
+      </w:r>
+    </w:p>
+    <w:p>
+      <w:pPr>
+        <w:jc w:val="both"/>
+        <w:rPr>
+          <w:rFonts w:ascii="Times New Roman" w:eastAsia="Times New Roman" w:hAnsi="Times New Roman" w:cs="Times New Roman"/>
+          <w:lang w:eastAsia="es-SV"/>
+        </w:rPr>
+      </w:pPr>
+      <w:r>
+        <w:rPr>
+          <w:rFonts w:ascii="Times New Roman" w:eastAsia="Times New Roman" w:hAnsi="Times New Roman" w:cs="Times New Roman"/>
+          <w:lang w:eastAsia="es-SV"/>
+        </w:rPr>
+        <w:t xml:space="preserve">• </w:t>
+      </w:r>
+      <w:r>
+        <w:rPr>
+          <w:rFonts w:ascii="Times New Roman" w:eastAsia="Times New Roman" w:hAnsi="Times New Roman" w:cs="Times New Roman"/>
+          <w:b/>
+          <w:bCs/>
+          <w:lang w:eastAsia="es-SV"/>
+        </w:rPr>
+        <w:t>Respuesta generada por la IA:</w:t>
+      </w:r>
+      <w:r>
+        <w:rPr>
+          <w:rFonts w:ascii="Times New Roman" w:eastAsia="Times New Roman" w:hAnsi="Times New Roman" w:cs="Times New Roman"/>
+          <w:lang w:eastAsia="es-SV"/>
+        </w:rPr>
+        <w:t xml:space="preserve"> Desglose arquitectónico del </w:t>
+      </w:r>
+      <w:proofErr w:type="spellStart"/>
+      <w:r>
+        <w:rPr>
+          <w:rFonts w:ascii="Times New Roman" w:eastAsia="Times New Roman" w:hAnsi="Times New Roman" w:cs="Times New Roman"/>
+          <w:lang w:eastAsia="es-SV"/>
+        </w:rPr>
+        <w:t>Layout</w:t>
+      </w:r>
+      <w:proofErr w:type="spellEnd"/>
+      <w:r>
+        <w:rPr>
+          <w:rFonts w:ascii="Times New Roman" w:eastAsia="Times New Roman" w:hAnsi="Times New Roman" w:cs="Times New Roman"/>
+          <w:lang w:eastAsia="es-SV"/>
+        </w:rPr>
+        <w:t xml:space="preserve"> adaptativo del carrito:</w:t>
+      </w:r>
+    </w:p>
+    <w:p>
+      <w:pPr>
+        <w:numPr>
+          <w:ilvl w:val="0"/>
+          <w:numId w:val="14"/>
+        </w:numPr>
+        <w:jc w:val="both"/>
+        <w:rPr>
+          <w:rFonts w:ascii="Times New Roman" w:eastAsia="Times New Roman" w:hAnsi="Times New Roman" w:cs="Times New Roman"/>
+          <w:lang w:eastAsia="es-SV"/>
+        </w:rPr>
+      </w:pPr>
+      <w:r>
+        <w:rPr>
+          <w:rFonts w:ascii="Times New Roman" w:eastAsia="Times New Roman" w:hAnsi="Times New Roman" w:cs="Times New Roman"/>
+          <w:b/>
+          <w:bCs/>
+          <w:lang w:eastAsia="es-SV"/>
+        </w:rPr>
+        <w:t xml:space="preserve">Posicionamiento </w:t>
+      </w:r>
+      <w:proofErr w:type="spellStart"/>
+      <w:r>
+        <w:rPr>
+          <w:rFonts w:ascii="Times New Roman" w:eastAsia="Times New Roman" w:hAnsi="Times New Roman" w:cs="Times New Roman"/>
+          <w:b/>
+          <w:bCs/>
+          <w:lang w:eastAsia="es-SV"/>
+        </w:rPr>
+        <w:t>Sticky</w:t>
+      </w:r>
+      <w:proofErr w:type="spellEnd"/>
+      <w:r>
+        <w:rPr>
+          <w:rFonts w:ascii="Times New Roman" w:eastAsia="Times New Roman" w:hAnsi="Times New Roman" w:cs="Times New Roman"/>
+          <w:b/>
+          <w:bCs/>
+          <w:lang w:eastAsia="es-SV"/>
+        </w:rPr>
+        <w:t>:</w:t>
+      </w:r>
+      <w:r>
+        <w:rPr>
+          <w:rFonts w:ascii="Times New Roman" w:eastAsia="Times New Roman" w:hAnsi="Times New Roman" w:cs="Times New Roman"/>
+          <w:lang w:eastAsia="es-SV"/>
+        </w:rPr>
+        <w:t xml:space="preserve"> Explicación de la propiedad position: </w:t>
+      </w:r>
+      <w:proofErr w:type="spellStart"/>
+      <w:r>
+        <w:rPr>
+          <w:rFonts w:ascii="Times New Roman" w:eastAsia="Times New Roman" w:hAnsi="Times New Roman" w:cs="Times New Roman"/>
+          <w:lang w:eastAsia="es-SV"/>
+        </w:rPr>
+        <w:t>sticky</w:t>
+      </w:r>
+      <w:proofErr w:type="spellEnd"/>
+      <w:r>
+        <w:rPr>
+          <w:rFonts w:ascii="Times New Roman" w:eastAsia="Times New Roman" w:hAnsi="Times New Roman" w:cs="Times New Roman"/>
+          <w:lang w:eastAsia="es-SV"/>
+        </w:rPr>
+        <w:t>; top: 20</w:t>
+      </w:r>
+      <w:proofErr w:type="gramStart"/>
+      <w:r>
+        <w:rPr>
+          <w:rFonts w:ascii="Times New Roman" w:eastAsia="Times New Roman" w:hAnsi="Times New Roman" w:cs="Times New Roman"/>
+          <w:lang w:eastAsia="es-SV"/>
+        </w:rPr>
+        <w:t>px;.</w:t>
+      </w:r>
+      <w:proofErr w:type="gramEnd"/>
+      <w:r>
+        <w:rPr>
+          <w:rFonts w:ascii="Times New Roman" w:eastAsia="Times New Roman" w:hAnsi="Times New Roman" w:cs="Times New Roman"/>
+          <w:lang w:eastAsia="es-SV"/>
+        </w:rPr>
+        <w:t xml:space="preserve"> Se aclaró que actúa como un híbrido: se comporta como un elemento normal en su flujo hasta que el </w:t>
+      </w:r>
+      <w:proofErr w:type="spellStart"/>
+      <w:r>
+        <w:rPr>
+          <w:rFonts w:ascii="Times New Roman" w:eastAsia="Times New Roman" w:hAnsi="Times New Roman" w:cs="Times New Roman"/>
+          <w:lang w:eastAsia="es-SV"/>
+        </w:rPr>
+        <w:t>scroll</w:t>
+      </w:r>
+      <w:proofErr w:type="spellEnd"/>
+      <w:r>
+        <w:rPr>
+          <w:rFonts w:ascii="Times New Roman" w:eastAsia="Times New Roman" w:hAnsi="Times New Roman" w:cs="Times New Roman"/>
+          <w:lang w:eastAsia="es-SV"/>
+        </w:rPr>
+        <w:t xml:space="preserve"> llega a su posición, momento en el que se "congela" en la pantalla para que el usuario siempre tenga el botón de </w:t>
+      </w:r>
+      <w:proofErr w:type="spellStart"/>
+      <w:r>
+        <w:rPr>
+          <w:rFonts w:ascii="Times New Roman" w:eastAsia="Times New Roman" w:hAnsi="Times New Roman" w:cs="Times New Roman"/>
+          <w:lang w:eastAsia="es-SV"/>
+        </w:rPr>
+        <w:t>checkout</w:t>
+      </w:r>
+      <w:proofErr w:type="spellEnd"/>
+      <w:r>
+        <w:rPr>
+          <w:rFonts w:ascii="Times New Roman" w:eastAsia="Times New Roman" w:hAnsi="Times New Roman" w:cs="Times New Roman"/>
+          <w:lang w:eastAsia="es-SV"/>
+        </w:rPr>
+        <w:t xml:space="preserve"> a la vista mientras revisa sus productos.</w:t>
+      </w:r>
+    </w:p>
+    <w:p>
+      <w:pPr>
+        <w:numPr>
+          <w:ilvl w:val="0"/>
+          <w:numId w:val="14"/>
+        </w:numPr>
+        <w:jc w:val="both"/>
+        <w:rPr>
+          <w:rFonts w:ascii="Times New Roman" w:eastAsia="Times New Roman" w:hAnsi="Times New Roman" w:cs="Times New Roman"/>
+          <w:lang w:eastAsia="es-SV"/>
+        </w:rPr>
+      </w:pPr>
+      <w:r>
+        <w:rPr>
+          <w:rFonts w:ascii="Times New Roman" w:eastAsia="Times New Roman" w:hAnsi="Times New Roman" w:cs="Times New Roman"/>
+          <w:b/>
+          <w:bCs/>
+          <w:lang w:eastAsia="es-SV"/>
+        </w:rPr>
+        <w:t xml:space="preserve">Estrategia del </w:t>
+      </w:r>
+      <w:proofErr w:type="spellStart"/>
+      <w:r>
+        <w:rPr>
+          <w:rFonts w:ascii="Times New Roman" w:eastAsia="Times New Roman" w:hAnsi="Times New Roman" w:cs="Times New Roman"/>
+          <w:b/>
+          <w:bCs/>
+          <w:lang w:eastAsia="es-SV"/>
+        </w:rPr>
+        <w:t>Grid</w:t>
+      </w:r>
+      <w:proofErr w:type="spellEnd"/>
+      <w:r>
+        <w:rPr>
+          <w:rFonts w:ascii="Times New Roman" w:eastAsia="Times New Roman" w:hAnsi="Times New Roman" w:cs="Times New Roman"/>
+          <w:b/>
+          <w:bCs/>
+          <w:lang w:eastAsia="es-SV"/>
+        </w:rPr>
+        <w:t xml:space="preserve"> Asimétrico:</w:t>
+      </w:r>
+      <w:r>
+        <w:rPr>
+          <w:rFonts w:ascii="Times New Roman" w:eastAsia="Times New Roman" w:hAnsi="Times New Roman" w:cs="Times New Roman"/>
+          <w:lang w:eastAsia="es-SV"/>
+        </w:rPr>
+        <w:t xml:space="preserve"> El valor 1fr 350px reserva un espacio fijo y exacto de 350 píxeles para el resumen de pago, mientras que la lista de productos (1fr) se expande dinámicamente para ocupar todo el espacio restante disponible.</w:t>
+      </w:r>
+    </w:p>
+    <w:p>
+      <w:pPr>
+        <w:numPr>
+          <w:ilvl w:val="0"/>
+          <w:numId w:val="14"/>
+        </w:numPr>
+        <w:jc w:val="both"/>
+        <w:rPr>
+          <w:rFonts w:ascii="Times New Roman" w:eastAsia="Times New Roman" w:hAnsi="Times New Roman" w:cs="Times New Roman"/>
+          <w:lang w:eastAsia="es-SV"/>
+        </w:rPr>
+      </w:pPr>
+      <w:r>
+        <w:rPr>
+          <w:rFonts w:ascii="Times New Roman" w:eastAsia="Times New Roman" w:hAnsi="Times New Roman" w:cs="Times New Roman"/>
+          <w:b/>
+          <w:bCs/>
+          <w:lang w:eastAsia="es-SV"/>
+        </w:rPr>
+        <w:t>Garantía Responsiva:</w:t>
+      </w:r>
+      <w:r>
+        <w:rPr>
+          <w:rFonts w:ascii="Times New Roman" w:eastAsia="Times New Roman" w:hAnsi="Times New Roman" w:cs="Times New Roman"/>
+          <w:lang w:eastAsia="es-SV"/>
+        </w:rPr>
+        <w:t xml:space="preserve"> Se dio un parte de tranquilidad explicando que en la sección de Media </w:t>
+      </w:r>
+      <w:proofErr w:type="spellStart"/>
+      <w:r>
+        <w:rPr>
+          <w:rFonts w:ascii="Times New Roman" w:eastAsia="Times New Roman" w:hAnsi="Times New Roman" w:cs="Times New Roman"/>
+          <w:lang w:eastAsia="es-SV"/>
+        </w:rPr>
+        <w:t>Queries</w:t>
+      </w:r>
+      <w:proofErr w:type="spellEnd"/>
+      <w:r>
+        <w:rPr>
+          <w:rFonts w:ascii="Times New Roman" w:eastAsia="Times New Roman" w:hAnsi="Times New Roman" w:cs="Times New Roman"/>
+          <w:lang w:eastAsia="es-SV"/>
+        </w:rPr>
+        <w:t xml:space="preserve"> (@media), ese </w:t>
+      </w:r>
+      <w:proofErr w:type="spellStart"/>
+      <w:r>
+        <w:rPr>
+          <w:rFonts w:ascii="Times New Roman" w:eastAsia="Times New Roman" w:hAnsi="Times New Roman" w:cs="Times New Roman"/>
+          <w:lang w:eastAsia="es-SV"/>
+        </w:rPr>
+        <w:t>grid</w:t>
+      </w:r>
+      <w:proofErr w:type="spellEnd"/>
+      <w:r>
+        <w:rPr>
+          <w:rFonts w:ascii="Times New Roman" w:eastAsia="Times New Roman" w:hAnsi="Times New Roman" w:cs="Times New Roman"/>
+          <w:lang w:eastAsia="es-SV"/>
+        </w:rPr>
+        <w:t xml:space="preserve"> se destruye intencionalmente en pantallas menores a 768px pasando a 1fr (una sola columna), lo que evita de forma absoluta que el diseño colapse o genere desbordamientos.</w:t>
+      </w:r>
+    </w:p>
+    <w:p>
+      <w:pPr>
+        <w:pStyle w:val="Prrafodelista"/>
+        <w:numPr>
+          <w:ilvl w:val="0"/>
+          <w:numId w:val="14"/>
+        </w:numPr>
+        <w:spacing w:before="100" w:beforeAutospacing="1" w:after="100" w:afterAutospacing="1" w:line="240" w:lineRule="auto"/>
+        <w:rPr>
+          <w:rFonts w:ascii="Times New Roman" w:eastAsia="Times New Roman" w:hAnsi="Times New Roman" w:cs="Times New Roman"/>
+          <w:kern w:val="0"/>
+          <w:lang w:eastAsia="es-SV"/>
+          <w14:ligatures w14:val="none"/>
+        </w:rPr>
+      </w:pPr>
+      <w:r>
+        <w:rPr>
+          <w:rFonts w:ascii="Times New Roman" w:eastAsia="Times New Roman" w:hAnsi="Times New Roman" w:cs="Times New Roman"/>
+          <w:kern w:val="0"/>
+          <w:lang w:eastAsia="es-SV"/>
+          <w14:ligatures w14:val="none"/>
+        </w:rPr>
+        <w:t xml:space="preserve">• </w:t>
+      </w:r>
+      <w:r>
+        <w:rPr>
+          <w:rFonts w:ascii="Times New Roman" w:eastAsia="Times New Roman" w:hAnsi="Times New Roman" w:cs="Times New Roman"/>
+          <w:b/>
+          <w:bCs/>
+          <w:kern w:val="0"/>
+          <w:lang w:eastAsia="es-SV"/>
+          <w14:ligatures w14:val="none"/>
+        </w:rPr>
+        <w:t>Resultado aplicado o adaptado en el proyecto:</w:t>
+      </w:r>
+      <w:r>
+        <w:rPr>
+          <w:rFonts w:ascii="Times New Roman" w:eastAsia="Times New Roman" w:hAnsi="Times New Roman" w:cs="Times New Roman"/>
+          <w:kern w:val="0"/>
+          <w:lang w:eastAsia="es-SV"/>
+          <w14:ligatures w14:val="none"/>
+        </w:rPr>
+        <w:t xml:space="preserve"> Implementación segura de la vista del carrito de compras. Se organizaron los contenedores asegurando que la experiencia de usuario fuera sumamente cómoda tanto en escritorio (con el resumen flotante fijo) como en dispositivos móviles (donde el resumen pasa limpiamente abajo de los productos).</w:t>
+      </w:r>
+    </w:p>
+    <w:p>
+      <w:pPr>
+        <w:pStyle w:val="Prrafodelista"/>
+        <w:numPr>
+          <w:ilvl w:val="0"/>
+          <w:numId w:val="14"/>
+        </w:numPr>
+        <w:spacing w:before="100" w:beforeAutospacing="1" w:after="100" w:afterAutospacing="1" w:line="240" w:lineRule="auto"/>
+        <w:rPr>
+          <w:rFonts w:ascii="Times New Roman" w:eastAsia="Times New Roman" w:hAnsi="Times New Roman" w:cs="Times New Roman"/>
+          <w:kern w:val="0"/>
+          <w:lang w:eastAsia="es-SV"/>
+          <w14:ligatures w14:val="none"/>
+        </w:rPr>
+      </w:pPr>
+      <w:r>
+        <w:rPr>
+          <w:rFonts w:ascii="Times New Roman" w:eastAsia="Times New Roman" w:hAnsi="Times New Roman" w:cs="Times New Roman"/>
+          <w:kern w:val="0"/>
+          <w:lang w:eastAsia="es-SV"/>
+          <w14:ligatures w14:val="none"/>
+        </w:rPr>
+        <w:t xml:space="preserve">• </w:t>
+      </w:r>
+      <w:r>
+        <w:rPr>
+          <w:rFonts w:ascii="Times New Roman" w:eastAsia="Times New Roman" w:hAnsi="Times New Roman" w:cs="Times New Roman"/>
+          <w:b/>
+          <w:bCs/>
+          <w:kern w:val="0"/>
+          <w:lang w:eastAsia="es-SV"/>
+          <w14:ligatures w14:val="none"/>
+        </w:rPr>
+        <w:t>Explicación breve del aporte de la IA en el proceso de desarrollo:</w:t>
+      </w:r>
+      <w:r>
+        <w:rPr>
+          <w:rFonts w:ascii="Times New Roman" w:eastAsia="Times New Roman" w:hAnsi="Times New Roman" w:cs="Times New Roman"/>
+          <w:kern w:val="0"/>
+          <w:lang w:eastAsia="es-SV"/>
+          <w14:ligatures w14:val="none"/>
+        </w:rPr>
+        <w:t xml:space="preserve"> Previno errores de maquetación críticos en la experiencia de pago (</w:t>
+      </w:r>
+      <w:proofErr w:type="spellStart"/>
+      <w:r>
+        <w:rPr>
+          <w:rFonts w:ascii="Times New Roman" w:eastAsia="Times New Roman" w:hAnsi="Times New Roman" w:cs="Times New Roman"/>
+          <w:kern w:val="0"/>
+          <w:lang w:eastAsia="es-SV"/>
+          <w14:ligatures w14:val="none"/>
+        </w:rPr>
+        <w:t>Checkout</w:t>
+      </w:r>
+      <w:proofErr w:type="spellEnd"/>
+      <w:r>
+        <w:rPr>
+          <w:rFonts w:ascii="Times New Roman" w:eastAsia="Times New Roman" w:hAnsi="Times New Roman" w:cs="Times New Roman"/>
+          <w:kern w:val="0"/>
+          <w:lang w:eastAsia="es-SV"/>
+          <w14:ligatures w14:val="none"/>
+        </w:rPr>
+        <w:t xml:space="preserve"> UX). La IA </w:t>
+      </w:r>
+      <w:proofErr w:type="spellStart"/>
+      <w:r>
+        <w:rPr>
+          <w:rFonts w:ascii="Times New Roman" w:eastAsia="Times New Roman" w:hAnsi="Times New Roman" w:cs="Times New Roman"/>
+          <w:kern w:val="0"/>
+          <w:lang w:eastAsia="es-SV"/>
+          <w14:ligatures w14:val="none"/>
+        </w:rPr>
+        <w:t>guió</w:t>
+      </w:r>
+      <w:proofErr w:type="spellEnd"/>
+      <w:r>
+        <w:rPr>
+          <w:rFonts w:ascii="Times New Roman" w:eastAsia="Times New Roman" w:hAnsi="Times New Roman" w:cs="Times New Roman"/>
+          <w:kern w:val="0"/>
+          <w:lang w:eastAsia="es-SV"/>
+          <w14:ligatures w14:val="none"/>
+        </w:rPr>
+        <w:t xml:space="preserve"> la transición del diseño bidimensional al flujo móvil, asegurando que los componentes interactivos prioritarios mantuvieran un orden jerárquico impecable en cualquier resolución.</w:t>
+      </w:r>
+    </w:p>
+    <w:p>
+      <w:pPr>
+        <w:spacing w:before="100" w:beforeAutospacing="1" w:after="100" w:afterAutospacing="1" w:line="240" w:lineRule="auto"/>
+        <w:rPr>
+          <w:rFonts w:ascii="Times New Roman" w:eastAsia="Times New Roman" w:hAnsi="Times New Roman" w:cs="Times New Roman"/>
+          <w:kern w:val="0"/>
+          <w:lang w:eastAsia="es-SV"/>
+          <w14:ligatures w14:val="none"/>
+        </w:rPr>
+      </w:pPr>
+    </w:p>
+    <w:p>
+      <w:pPr>
+        <w:spacing w:before="100" w:beforeAutospacing="1" w:after="100" w:afterAutospacing="1" w:line="240" w:lineRule="auto"/>
+        <w:outlineLvl w:val="2"/>
+        <w:rPr>
+          <w:rFonts w:ascii="Segoe UI Emoji" w:eastAsia="Times New Roman" w:hAnsi="Segoe UI Emoji" w:cs="Segoe UI Emoji"/>
+          <w:b/>
+          <w:bCs/>
+          <w:kern w:val="0"/>
+          <w:sz w:val="27"/>
+          <w:szCs w:val="27"/>
+          <w:lang w:eastAsia="es-SV"/>
+          <w14:ligatures w14:val="none"/>
+        </w:rPr>
+      </w:pPr>
+    </w:p>
+    <w:p>
+      <w:pPr>
+        <w:spacing w:before="100" w:beforeAutospacing="1" w:after="100" w:afterAutospacing="1" w:line="240" w:lineRule="auto"/>
+        <w:outlineLvl w:val="2"/>
+        <w:rPr>
+          <w:rFonts w:ascii="Segoe UI Emoji" w:eastAsia="Times New Roman" w:hAnsi="Segoe UI Emoji" w:cs="Segoe UI Emoji"/>
+          <w:b/>
+          <w:bCs/>
+          <w:kern w:val="0"/>
+          <w:sz w:val="27"/>
+          <w:szCs w:val="27"/>
+          <w:lang w:eastAsia="es-SV"/>
+          <w14:ligatures w14:val="none"/>
+        </w:rPr>
+      </w:pPr>
+    </w:p>
+    <w:p>
+      <w:pPr>
+        <w:spacing w:before="100" w:beforeAutospacing="1" w:after="100" w:afterAutospacing="1" w:line="240" w:lineRule="auto"/>
+        <w:outlineLvl w:val="2"/>
+        <w:rPr>
+          <w:rFonts w:ascii="Segoe UI Emoji" w:eastAsia="Times New Roman" w:hAnsi="Segoe UI Emoji" w:cs="Segoe UI Emoji"/>
+          <w:b/>
+          <w:bCs/>
+          <w:kern w:val="0"/>
+          <w:sz w:val="27"/>
+          <w:szCs w:val="27"/>
+          <w:lang w:eastAsia="es-SV"/>
+          <w14:ligatures w14:val="none"/>
+        </w:rPr>
+      </w:pPr>
+    </w:p>
+    <w:p>
+      <w:pPr>
+        <w:spacing w:before="100" w:beforeAutospacing="1" w:after="100" w:afterAutospacing="1" w:line="240" w:lineRule="auto"/>
+        <w:outlineLvl w:val="2"/>
+        <w:rPr>
+          <w:rFonts w:ascii="Times New Roman" w:eastAsia="Times New Roman" w:hAnsi="Times New Roman" w:cs="Times New Roman"/>
+          <w:b/>
+          <w:bCs/>
+          <w:kern w:val="0"/>
+          <w:sz w:val="27"/>
+          <w:szCs w:val="27"/>
+          <w:lang w:eastAsia="es-SV"/>
+          <w14:ligatures w14:val="none"/>
+        </w:rPr>
+      </w:pPr>
+      <w:r>
+        <w:rPr>
+          <w:rFonts w:ascii="Times New Roman" w:eastAsia="Times New Roman" w:hAnsi="Times New Roman" w:cs="Times New Roman"/>
+          <w:b/>
+          <w:bCs/>
+          <w:kern w:val="0"/>
+          <w:sz w:val="27"/>
+          <w:szCs w:val="27"/>
+          <w:lang w:eastAsia="es-SV"/>
+          <w14:ligatures w14:val="none"/>
+        </w:rPr>
+        <w:lastRenderedPageBreak/>
+        <w:t xml:space="preserve"> CONTROL DE COMPORTAMIENTO Y CENTRADO DE BOTONES EN EL HERO</w:t>
+      </w:r>
+    </w:p>
+    <w:p>
+      <w:pPr>
+        <w:pStyle w:val="Prrafodelista"/>
+        <w:spacing w:before="100" w:beforeAutospacing="1" w:after="100" w:afterAutospacing="1" w:line="240" w:lineRule="auto"/>
+        <w:rPr>
+          <w:rFonts w:ascii="Times New Roman" w:eastAsia="Times New Roman" w:hAnsi="Times New Roman" w:cs="Times New Roman"/>
+          <w:kern w:val="0"/>
+          <w:lang w:eastAsia="es-SV"/>
+          <w14:ligatures w14:val="none"/>
+        </w:rPr>
+      </w:pPr>
+    </w:p>
+    <w:p>
+      <w:pPr>
+        <w:pStyle w:val="Prrafodelista"/>
+        <w:spacing w:before="100" w:beforeAutospacing="1" w:after="100" w:afterAutospacing="1" w:line="240" w:lineRule="auto"/>
+        <w:rPr>
+          <w:rFonts w:ascii="Times New Roman" w:eastAsia="Times New Roman" w:hAnsi="Times New Roman" w:cs="Times New Roman"/>
+          <w:kern w:val="0"/>
+          <w:lang w:eastAsia="es-SV"/>
+          <w14:ligatures w14:val="none"/>
+        </w:rPr>
+      </w:pPr>
+    </w:p>
+    <w:p>
+      <w:pPr>
+        <w:pStyle w:val="Prrafodelista"/>
+        <w:spacing w:before="100" w:beforeAutospacing="1" w:after="100" w:afterAutospacing="1" w:line="240" w:lineRule="auto"/>
+        <w:rPr>
+          <w:rFonts w:ascii="Times New Roman" w:eastAsia="Times New Roman" w:hAnsi="Times New Roman" w:cs="Times New Roman"/>
+          <w:kern w:val="0"/>
+          <w:lang w:eastAsia="es-SV"/>
+          <w14:ligatures w14:val="none"/>
+        </w:rPr>
+      </w:pPr>
+    </w:p>
+    <w:p>
+      <w:pPr>
+        <w:pStyle w:val="Prrafodelista"/>
+        <w:spacing w:before="100" w:beforeAutospacing="1" w:after="100" w:afterAutospacing="1" w:line="240" w:lineRule="auto"/>
+        <w:rPr>
+          <w:rFonts w:ascii="Times New Roman" w:eastAsia="Times New Roman" w:hAnsi="Times New Roman" w:cs="Times New Roman"/>
+          <w:kern w:val="0"/>
+          <w:lang w:eastAsia="es-SV"/>
+          <w14:ligatures w14:val="none"/>
+        </w:rPr>
+      </w:pPr>
+    </w:p>
+    <w:p>
+      <w:pPr>
+        <w:pStyle w:val="Prrafodelista"/>
+        <w:spacing w:before="100" w:beforeAutospacing="1" w:after="100" w:afterAutospacing="1" w:line="240" w:lineRule="auto"/>
+        <w:rPr>
+          <w:rFonts w:ascii="Times New Roman" w:eastAsia="Times New Roman" w:hAnsi="Times New Roman" w:cs="Times New Roman"/>
+          <w:kern w:val="0"/>
+          <w:lang w:eastAsia="es-SV"/>
+          <w14:ligatures w14:val="none"/>
+        </w:rPr>
+      </w:pPr>
+      <w:r>
+        <w:rPr>
+          <w:rFonts w:ascii="Times New Roman" w:eastAsia="Times New Roman" w:hAnsi="Times New Roman" w:cs="Times New Roman"/>
+          <w:kern w:val="0"/>
+          <w:lang w:eastAsia="es-SV"/>
+          <w14:ligatures w14:val="none"/>
+        </w:rPr>
+        <w:t xml:space="preserve">• </w:t>
+      </w:r>
+      <w:proofErr w:type="spellStart"/>
+      <w:r>
+        <w:rPr>
+          <w:rFonts w:ascii="Times New Roman" w:eastAsia="Times New Roman" w:hAnsi="Times New Roman" w:cs="Times New Roman"/>
+          <w:b/>
+          <w:bCs/>
+          <w:kern w:val="0"/>
+          <w:lang w:eastAsia="es-SV"/>
+          <w14:ligatures w14:val="none"/>
+        </w:rPr>
+        <w:t>Prompt</w:t>
+      </w:r>
+      <w:proofErr w:type="spellEnd"/>
+      <w:r>
+        <w:rPr>
+          <w:rFonts w:ascii="Times New Roman" w:eastAsia="Times New Roman" w:hAnsi="Times New Roman" w:cs="Times New Roman"/>
+          <w:b/>
+          <w:bCs/>
+          <w:kern w:val="0"/>
+          <w:lang w:eastAsia="es-SV"/>
+          <w14:ligatures w14:val="none"/>
+        </w:rPr>
+        <w:t xml:space="preserve"> utilizado:</w:t>
+      </w:r>
+    </w:p>
+    <w:p>
+      <w:pPr>
+        <w:pStyle w:val="Prrafodelista"/>
+        <w:spacing w:after="0" w:line="240" w:lineRule="auto"/>
+        <w:rPr>
+          <w:rFonts w:ascii="Times New Roman" w:eastAsia="Times New Roman" w:hAnsi="Times New Roman" w:cs="Times New Roman"/>
+          <w:kern w:val="0"/>
+          <w:lang w:eastAsia="es-SV"/>
+          <w14:ligatures w14:val="none"/>
+        </w:rPr>
+      </w:pPr>
+      <w:proofErr w:type="spellStart"/>
+      <w:r>
+        <w:rPr>
+          <w:rFonts w:ascii="Times New Roman" w:eastAsia="Times New Roman" w:hAnsi="Times New Roman" w:cs="Times New Roman"/>
+          <w:kern w:val="0"/>
+          <w:lang w:eastAsia="es-SV"/>
+          <w14:ligatures w14:val="none"/>
+        </w:rPr>
+        <w:t>Mirá</w:t>
+      </w:r>
+      <w:proofErr w:type="spellEnd"/>
+      <w:r>
+        <w:rPr>
+          <w:rFonts w:ascii="Times New Roman" w:eastAsia="Times New Roman" w:hAnsi="Times New Roman" w:cs="Times New Roman"/>
+          <w:kern w:val="0"/>
+          <w:lang w:eastAsia="es-SV"/>
+          <w14:ligatures w14:val="none"/>
+        </w:rPr>
+        <w:t>, los botones del Hero se me están poniendo uno encima del otro y se van todos a la izquierda, se mira horrible. Yo quiero que queden centrados y alineados uno al lado del otro de forma simétrica en el bloque de texto. ¿Qué me falta ponerles en el CSS para que se arregle eso?</w:t>
+      </w:r>
+    </w:p>
+    <w:p>
+      <w:pPr>
+        <w:jc w:val="both"/>
+        <w:rPr>
+          <w:rFonts w:ascii="Times New Roman" w:eastAsia="Times New Roman" w:hAnsi="Times New Roman" w:cs="Times New Roman"/>
+          <w:lang w:eastAsia="es-SV"/>
+        </w:rPr>
+      </w:pPr>
+    </w:p>
+    <w:p>
+      <w:pPr>
+        <w:jc w:val="both"/>
+        <w:rPr>
+          <w:rFonts w:ascii="Times New Roman" w:eastAsia="Times New Roman" w:hAnsi="Times New Roman" w:cs="Times New Roman"/>
+          <w:lang w:eastAsia="es-SV"/>
+        </w:rPr>
+      </w:pPr>
+    </w:p>
+    <w:p>
+      <w:pPr>
+        <w:jc w:val="both"/>
+        <w:rPr>
+          <w:rFonts w:ascii="Times New Roman" w:eastAsia="Times New Roman" w:hAnsi="Times New Roman" w:cs="Times New Roman"/>
+          <w:lang w:eastAsia="es-SV"/>
+        </w:rPr>
+      </w:pPr>
+    </w:p>
+    <w:p>
+      <w:pPr>
+        <w:jc w:val="both"/>
+        <w:rPr>
+          <w:rFonts w:ascii="Times New Roman" w:eastAsia="Times New Roman" w:hAnsi="Times New Roman" w:cs="Times New Roman"/>
+          <w:b/>
+          <w:bCs/>
+          <w:lang w:eastAsia="es-SV"/>
+        </w:rPr>
+      </w:pPr>
+      <w:r>
+        <w:rPr>
+          <w:rFonts w:ascii="Times New Roman" w:eastAsia="Times New Roman" w:hAnsi="Times New Roman" w:cs="Times New Roman"/>
+          <w:b/>
+          <w:bCs/>
+          <w:lang w:eastAsia="es-SV"/>
+        </w:rPr>
+        <w:t>CREACIÓN DE UN BADGE FLOTANTE ("ESPECIAL" / "PROMO") EN LAS TARJETAS</w:t>
+      </w:r>
+    </w:p>
+    <w:p>
+      <w:pPr>
+        <w:jc w:val="both"/>
+        <w:rPr>
+          <w:rFonts w:ascii="Times New Roman" w:eastAsia="Times New Roman" w:hAnsi="Times New Roman" w:cs="Times New Roman"/>
+          <w:lang w:eastAsia="es-SV"/>
+        </w:rPr>
+      </w:pPr>
+      <w:r>
+        <w:rPr>
+          <w:rFonts w:ascii="Times New Roman" w:eastAsia="Times New Roman" w:hAnsi="Times New Roman" w:cs="Times New Roman"/>
+          <w:lang w:eastAsia="es-SV"/>
+        </w:rPr>
+        <w:t xml:space="preserve">• </w:t>
+      </w:r>
+      <w:proofErr w:type="spellStart"/>
+      <w:r>
+        <w:rPr>
+          <w:rFonts w:ascii="Times New Roman" w:eastAsia="Times New Roman" w:hAnsi="Times New Roman" w:cs="Times New Roman"/>
+          <w:b/>
+          <w:bCs/>
+          <w:lang w:eastAsia="es-SV"/>
+        </w:rPr>
+        <w:t>Prompt</w:t>
+      </w:r>
+      <w:proofErr w:type="spellEnd"/>
+      <w:r>
+        <w:rPr>
+          <w:rFonts w:ascii="Times New Roman" w:eastAsia="Times New Roman" w:hAnsi="Times New Roman" w:cs="Times New Roman"/>
+          <w:b/>
+          <w:bCs/>
+          <w:lang w:eastAsia="es-SV"/>
+        </w:rPr>
+        <w:t xml:space="preserve"> utilizado:</w:t>
+      </w:r>
+    </w:p>
+    <w:p>
+      <w:pPr>
+        <w:jc w:val="both"/>
+        <w:rPr>
+          <w:rFonts w:ascii="Times New Roman" w:eastAsia="Times New Roman" w:hAnsi="Times New Roman" w:cs="Times New Roman"/>
+          <w:lang w:eastAsia="es-SV"/>
+        </w:rPr>
+      </w:pPr>
+      <w:r>
+        <w:rPr>
+          <w:rFonts w:ascii="Times New Roman" w:eastAsia="Times New Roman" w:hAnsi="Times New Roman" w:cs="Times New Roman"/>
+          <w:lang w:eastAsia="es-SV"/>
+        </w:rPr>
+        <w:t xml:space="preserve">Hey </w:t>
+      </w:r>
+      <w:proofErr w:type="spellStart"/>
+      <w:r>
+        <w:rPr>
+          <w:rFonts w:ascii="Times New Roman" w:eastAsia="Times New Roman" w:hAnsi="Times New Roman" w:cs="Times New Roman"/>
+          <w:lang w:eastAsia="es-SV"/>
+        </w:rPr>
+        <w:t>bro</w:t>
+      </w:r>
+      <w:proofErr w:type="spellEnd"/>
+      <w:r>
+        <w:rPr>
+          <w:rFonts w:ascii="Times New Roman" w:eastAsia="Times New Roman" w:hAnsi="Times New Roman" w:cs="Times New Roman"/>
+          <w:lang w:eastAsia="es-SV"/>
+        </w:rPr>
+        <w:t>, quiero que algunas tarjetas de comida lleven una etiqueta arriba a la derecha que diga "Popular" o "Nuevo", pero quiero que flote encima de la foto del plato sin mover el texto de abajo. ¿Cómo hago eso con position absolute en el CSS?</w:t>
+      </w:r>
+    </w:p>
+    <w:p>
+      <w:pPr>
+        <w:jc w:val="both"/>
+        <w:rPr>
+          <w:rFonts w:ascii="Times New Roman" w:eastAsia="Times New Roman" w:hAnsi="Times New Roman" w:cs="Times New Roman"/>
+          <w:lang w:eastAsia="es-SV"/>
+        </w:rPr>
+      </w:pPr>
+      <w:r>
+        <w:rPr>
+          <w:rFonts w:ascii="Times New Roman" w:eastAsia="Times New Roman" w:hAnsi="Times New Roman" w:cs="Times New Roman"/>
+          <w:b/>
+          <w:bCs/>
+          <w:lang w:eastAsia="es-SV"/>
+        </w:rPr>
+        <w:t>Respuesta generada por la IA:</w:t>
+      </w:r>
+      <w:r>
+        <w:rPr>
+          <w:rFonts w:ascii="Times New Roman" w:eastAsia="Times New Roman" w:hAnsi="Times New Roman" w:cs="Times New Roman"/>
+          <w:lang w:eastAsia="es-SV"/>
+        </w:rPr>
+        <w:t xml:space="preserve"> Explicación sobre el comportamiento de coordenadas empleando el sistema de posicionamiento relativo y absoluto combinado. Para que un elemento hijo flote de forma exacta, el contenedor padre </w:t>
+      </w:r>
+      <w:r>
+        <w:rPr>
+          <w:rFonts w:ascii="Times New Roman" w:eastAsia="Times New Roman" w:hAnsi="Times New Roman" w:cs="Times New Roman"/>
+          <w:i/>
+          <w:iCs/>
+          <w:lang w:eastAsia="es-SV"/>
+        </w:rPr>
+        <w:t>debe</w:t>
+      </w:r>
+      <w:r>
+        <w:rPr>
+          <w:rFonts w:ascii="Times New Roman" w:eastAsia="Times New Roman" w:hAnsi="Times New Roman" w:cs="Times New Roman"/>
+          <w:lang w:eastAsia="es-SV"/>
+        </w:rPr>
+        <w:t xml:space="preserve"> tener una postura de referencia:</w:t>
+      </w:r>
+    </w:p>
+    <w:p>
+      <w:pPr>
+        <w:jc w:val="both"/>
+        <w:rPr>
+          <w:rFonts w:ascii="Times New Roman" w:eastAsia="Times New Roman" w:hAnsi="Times New Roman" w:cs="Times New Roman"/>
+          <w:lang w:eastAsia="es-SV"/>
+        </w:rPr>
+      </w:pPr>
+    </w:p>
+    <w:p>
+      <w:pPr>
+        <w:jc w:val="both"/>
+        <w:rPr>
+          <w:rFonts w:ascii="Times New Roman" w:eastAsia="Times New Roman" w:hAnsi="Times New Roman" w:cs="Times New Roman"/>
+          <w:lang w:eastAsia="es-SV"/>
+        </w:rPr>
+      </w:pPr>
+      <w:r>
+        <w:rPr>
+          <w:rFonts w:ascii="Times New Roman" w:eastAsia="Times New Roman" w:hAnsi="Times New Roman" w:cs="Times New Roman"/>
+          <w:lang w:eastAsia="es-SV"/>
+        </w:rPr>
+        <w:drawing>
+          <wp:anchor distT="0" distB="0" distL="114300" distR="114300" simplePos="0" relativeHeight="251664384" behindDoc="0" locked="0" layoutInCell="1" allowOverlap="1" wp14:anchorId="712BCB3D" wp14:editId="5DCF68C6">
+            <wp:simplePos x="1082040" y="6195060"/>
+            <wp:positionH relativeFrom="column">
+              <wp:align>left</wp:align>
+            </wp:positionH>
+            <wp:positionV relativeFrom="paragraph">
+              <wp:align>top</wp:align>
+            </wp:positionV>
+            <wp:extent cx="5612130" cy="571500"/>
+            <wp:effectExtent l="0" t="0" r="7620" b="0"/>
+            <wp:wrapSquare wrapText="bothSides"/>
+            <wp:docPr id="78667417" name="Imagen 1"/>
+            <wp:cNvGraphicFramePr>
+              <a:graphicFrameLocks xmlns:a="http://schemas.openxmlformats.org/drawingml/2006/main" noChangeAspect="1"/>
+            </wp:cNvGraphicFramePr>
+            <a:graphic xmlns:a="http://schemas.openxmlformats.org/drawingml/2006/main">
+              <a:graphicData uri="http://schemas.openxmlformats.org/drawingml/2006/picture">
+                <pic:pic xmlns:pic="http://schemas.openxmlformats.org/drawingml/2006/picture">
+                  <pic:nvPicPr>
+                    <pic:cNvPr id="78667417" name=""/>
+                    <pic:cNvPicPr/>
+                  </pic:nvPicPr>
+                  <pic:blipFill>
+                    <a:blip r:embed="rId15">
+                      <a:extLst>
+                        <a:ext uri="{28A0092B-C50C-407E-A947-70E740481C1C}">
+                          <a14:useLocalDpi xmlns:a14="http://schemas.microsoft.com/office/drawing/2010/main" val="0"/>
+                        </a:ext>
+                      </a:extLst>
+                    </a:blip>
+                    <a:stretch>
+                      <a:fillRect/>
+                    </a:stretch>
+                  </pic:blipFill>
+                  <pic:spPr>
+                    <a:xfrm>
+                      <a:off x="0" y="0"/>
+                      <a:ext cx="5612130" cy="571500"/>
+                    </a:xfrm>
+                    <a:prstGeom prst="rect">
+                      <a:avLst/>
+                    </a:prstGeom>
+                  </pic:spPr>
+                </pic:pic>
+              </a:graphicData>
+            </a:graphic>
+          </wp:anchor>
+        </w:drawing>
+      </w:r>
+    </w:p>
+    <w:p>
+      <w:pPr>
+        <w:jc w:val="both"/>
+        <w:rPr>
+          <w:rFonts w:ascii="Times New Roman" w:eastAsia="Times New Roman" w:hAnsi="Times New Roman" w:cs="Times New Roman"/>
+          <w:lang w:eastAsia="es-SV"/>
+        </w:rPr>
+      </w:pPr>
+    </w:p>
+    <w:p>
+      <w:pPr>
+        <w:jc w:val="both"/>
+        <w:rPr>
+          <w:rFonts w:ascii="Times New Roman" w:eastAsia="Times New Roman" w:hAnsi="Times New Roman" w:cs="Times New Roman"/>
+          <w:lang w:eastAsia="es-SV"/>
+        </w:rPr>
+      </w:pPr>
+      <w:r>
+        <w:rPr>
+          <w:rFonts w:ascii="Times New Roman" w:eastAsia="Times New Roman" w:hAnsi="Times New Roman" w:cs="Times New Roman"/>
+          <w:lang w:eastAsia="es-SV"/>
+        </w:rPr>
+        <w:lastRenderedPageBreak/>
+        <w:drawing>
+          <wp:anchor distT="0" distB="0" distL="114300" distR="114300" simplePos="0" relativeHeight="251665408" behindDoc="1" locked="0" layoutInCell="1" allowOverlap="1" wp14:anchorId="2A54088E" wp14:editId="47A92031">
+            <wp:simplePos x="0" y="0"/>
+            <wp:positionH relativeFrom="column">
+              <wp:posOffset>-179070</wp:posOffset>
+            </wp:positionH>
+            <wp:positionV relativeFrom="paragraph">
+              <wp:posOffset>0</wp:posOffset>
+            </wp:positionV>
+            <wp:extent cx="5612130" cy="2494280"/>
+            <wp:effectExtent l="0" t="0" r="7620" b="1270"/>
+            <wp:wrapTight wrapText="bothSides">
+              <wp:wrapPolygon edited="0">
+                <wp:start x="0" y="0"/>
+                <wp:lineTo x="0" y="21446"/>
+                <wp:lineTo x="21556" y="21446"/>
+                <wp:lineTo x="21556" y="0"/>
+                <wp:lineTo x="0" y="0"/>
+              </wp:wrapPolygon>
+            </wp:wrapTight>
+            <wp:docPr id="1353321914" name="Imagen 1"/>
+            <wp:cNvGraphicFramePr>
+              <a:graphicFrameLocks xmlns:a="http://schemas.openxmlformats.org/drawingml/2006/main" noChangeAspect="1"/>
+            </wp:cNvGraphicFramePr>
+            <a:graphic xmlns:a="http://schemas.openxmlformats.org/drawingml/2006/main">
+              <a:graphicData uri="http://schemas.openxmlformats.org/drawingml/2006/picture">
+                <pic:pic xmlns:pic="http://schemas.openxmlformats.org/drawingml/2006/picture">
+                  <pic:nvPicPr>
+                    <pic:cNvPr id="1353321914" name=""/>
+                    <pic:cNvPicPr/>
+                  </pic:nvPicPr>
+                  <pic:blipFill>
+                    <a:blip r:embed="rId16">
+                      <a:extLst>
+                        <a:ext uri="{28A0092B-C50C-407E-A947-70E740481C1C}">
+                          <a14:useLocalDpi xmlns:a14="http://schemas.microsoft.com/office/drawing/2010/main" val="0"/>
+                        </a:ext>
+                      </a:extLst>
+                    </a:blip>
+                    <a:stretch>
+                      <a:fillRect/>
+                    </a:stretch>
+                  </pic:blipFill>
+                  <pic:spPr>
+                    <a:xfrm>
+                      <a:off x="0" y="0"/>
+                      <a:ext cx="5612130" cy="2494280"/>
+                    </a:xfrm>
+                    <a:prstGeom prst="rect">
+                      <a:avLst/>
+                    </a:prstGeom>
+                  </pic:spPr>
+                </pic:pic>
+              </a:graphicData>
+            </a:graphic>
+          </wp:anchor>
+        </w:drawing>
+      </w:r>
+      <w:r>
+        <w:rPr>
+          <w:rFonts w:ascii="Times New Roman" w:eastAsia="Times New Roman" w:hAnsi="Times New Roman" w:cs="Times New Roman"/>
+          <w:lang w:eastAsia="es-SV"/>
+        </w:rPr>
+        <w:br w:type="textWrapping" w:clear="all"/>
+      </w:r>
+      <w:r>
+        <w:rPr>
+          <w:rFonts w:eastAsia="Times New Roman"/>
+          <w:lang w:eastAsia="es-SV"/>
+        </w:rPr>
+        <w:t xml:space="preserve">• </w:t>
+      </w:r>
+      <w:r>
+        <w:rPr>
+          <w:rFonts w:eastAsia="Times New Roman"/>
+          <w:b/>
+          <w:bCs/>
+          <w:lang w:eastAsia="es-SV"/>
+        </w:rPr>
+        <w:t>Resultado aplicado o adaptado en el proyecto:</w:t>
+      </w:r>
+      <w:r>
+        <w:rPr>
+          <w:rFonts w:eastAsia="Times New Roman"/>
+          <w:lang w:eastAsia="es-SV"/>
+        </w:rPr>
+        <w:t xml:space="preserve"> Implementación de etiquetas promocionales en los combos estrella del menú. El </w:t>
+      </w:r>
+      <w:proofErr w:type="spellStart"/>
+      <w:r>
+        <w:rPr>
+          <w:rFonts w:eastAsia="Times New Roman"/>
+          <w:lang w:eastAsia="es-SV"/>
+        </w:rPr>
+        <w:t>badge</w:t>
+      </w:r>
+      <w:proofErr w:type="spellEnd"/>
+      <w:r>
+        <w:rPr>
+          <w:rFonts w:eastAsia="Times New Roman"/>
+          <w:lang w:eastAsia="es-SV"/>
+        </w:rPr>
+        <w:t xml:space="preserve"> se posiciona milimétricamente en la esquina superior derecha de la tarjeta blanca, superponiéndose sutilmente a los elementos internos sin alterar los márgenes ni el centrado del título.</w:t>
+      </w:r>
+    </w:p>
+    <w:p>
+      <w:pPr>
+        <w:tabs>
+          <w:tab w:val="left" w:pos="1152"/>
+        </w:tabs>
+        <w:rPr>
+          <w:rFonts w:ascii="Times New Roman" w:eastAsia="Times New Roman" w:hAnsi="Times New Roman" w:cs="Times New Roman"/>
+          <w:lang w:eastAsia="es-SV"/>
+        </w:rPr>
+      </w:pPr>
+      <w:r>
+        <w:rPr>
+          <w:rFonts w:ascii="Times New Roman" w:eastAsia="Times New Roman" w:hAnsi="Times New Roman" w:cs="Times New Roman"/>
+          <w:lang w:eastAsia="es-SV"/>
+        </w:rPr>
+        <w:t xml:space="preserve">• </w:t>
+      </w:r>
+      <w:r>
+        <w:rPr>
+          <w:rFonts w:ascii="Times New Roman" w:eastAsia="Times New Roman" w:hAnsi="Times New Roman" w:cs="Times New Roman"/>
+          <w:b/>
+          <w:bCs/>
+          <w:lang w:eastAsia="es-SV"/>
+        </w:rPr>
+        <w:t>Explicación breve del aporte de la IA en el proceso de desarrollo:</w:t>
+      </w:r>
+      <w:r>
+        <w:rPr>
+          <w:rFonts w:ascii="Times New Roman" w:eastAsia="Times New Roman" w:hAnsi="Times New Roman" w:cs="Times New Roman"/>
+          <w:lang w:eastAsia="es-SV"/>
+        </w:rPr>
+        <w:t xml:space="preserve"> Instruyó en el uso del posicionamiento avanzado de CSS (Absolute </w:t>
+      </w:r>
+      <w:proofErr w:type="spellStart"/>
+      <w:r>
+        <w:rPr>
+          <w:rFonts w:ascii="Times New Roman" w:eastAsia="Times New Roman" w:hAnsi="Times New Roman" w:cs="Times New Roman"/>
+          <w:lang w:eastAsia="es-SV"/>
+        </w:rPr>
+        <w:t>Positioning</w:t>
+      </w:r>
+      <w:proofErr w:type="spellEnd"/>
+      <w:r>
+        <w:rPr>
+          <w:rFonts w:ascii="Times New Roman" w:eastAsia="Times New Roman" w:hAnsi="Times New Roman" w:cs="Times New Roman"/>
+          <w:lang w:eastAsia="es-SV"/>
+        </w:rPr>
+        <w:t xml:space="preserve"> </w:t>
+      </w:r>
+      <w:proofErr w:type="spellStart"/>
+      <w:r>
+        <w:rPr>
+          <w:rFonts w:ascii="Times New Roman" w:eastAsia="Times New Roman" w:hAnsi="Times New Roman" w:cs="Times New Roman"/>
+          <w:lang w:eastAsia="es-SV"/>
+        </w:rPr>
+        <w:t>Context</w:t>
+      </w:r>
+      <w:proofErr w:type="spellEnd"/>
+      <w:r>
+        <w:rPr>
+          <w:rFonts w:ascii="Times New Roman" w:eastAsia="Times New Roman" w:hAnsi="Times New Roman" w:cs="Times New Roman"/>
+          <w:lang w:eastAsia="es-SV"/>
+        </w:rPr>
+        <w:t xml:space="preserve">), resolviendo la duda de cómo superponer elementos visuales de conversión (etiquetas de marketing) de forma limpia sin romper las cajas del </w:t>
+      </w:r>
+      <w:proofErr w:type="spellStart"/>
+      <w:r>
+        <w:rPr>
+          <w:rFonts w:ascii="Times New Roman" w:eastAsia="Times New Roman" w:hAnsi="Times New Roman" w:cs="Times New Roman"/>
+          <w:lang w:eastAsia="es-SV"/>
+        </w:rPr>
+        <w:t>Grid</w:t>
+      </w:r>
+      <w:proofErr w:type="spellEnd"/>
+      <w:r>
+        <w:rPr>
+          <w:rFonts w:ascii="Times New Roman" w:eastAsia="Times New Roman" w:hAnsi="Times New Roman" w:cs="Times New Roman"/>
+          <w:lang w:eastAsia="es-SV"/>
+        </w:rPr>
+        <w:t xml:space="preserve"> nativo.</w:t>
+      </w:r>
+    </w:p>
+    <w:p>
+      <w:pPr>
+        <w:tabs>
+          <w:tab w:val="left" w:pos="1152"/>
+        </w:tabs>
+        <w:rPr>
+          <w:rFonts w:ascii="Times New Roman" w:eastAsia="Times New Roman" w:hAnsi="Times New Roman" w:cs="Times New Roman"/>
+          <w:lang w:eastAsia="es-SV"/>
+        </w:rPr>
+      </w:pPr>
+    </w:p>
+    <w:p>
+      <w:pPr>
+        <w:tabs>
+          <w:tab w:val="left" w:pos="1152"/>
+        </w:tabs>
+        <w:rPr>
+          <w:rFonts w:ascii="Times New Roman" w:eastAsia="Times New Roman" w:hAnsi="Times New Roman" w:cs="Times New Roman"/>
+          <w:lang w:eastAsia="es-SV"/>
+        </w:rPr>
+      </w:pPr>
+    </w:p>
+    <w:p>
+      <w:pPr>
+        <w:tabs>
+          <w:tab w:val="left" w:pos="1152"/>
+        </w:tabs>
+        <w:rPr>
+          <w:rFonts w:ascii="Times New Roman" w:eastAsia="Times New Roman" w:hAnsi="Times New Roman" w:cs="Times New Roman"/>
+          <w:lang w:eastAsia="es-SV"/>
+        </w:rPr>
+      </w:pPr>
+    </w:p>
+    <w:p>
+      <w:pPr>
+        <w:tabs>
+          <w:tab w:val="left" w:pos="1152"/>
+        </w:tabs>
+        <w:rPr>
+          <w:rFonts w:ascii="Times New Roman" w:eastAsia="Times New Roman" w:hAnsi="Times New Roman" w:cs="Times New Roman"/>
+          <w:lang w:eastAsia="es-SV"/>
+        </w:rPr>
+      </w:pPr>
+    </w:p>
+    <w:p>
+      <w:pPr>
+        <w:tabs>
+          <w:tab w:val="left" w:pos="1152"/>
+        </w:tabs>
+        <w:rPr>
+          <w:rFonts w:ascii="Times New Roman" w:eastAsia="Times New Roman" w:hAnsi="Times New Roman" w:cs="Times New Roman"/>
+          <w:lang w:eastAsia="es-SV"/>
+        </w:rPr>
+      </w:pPr>
+    </w:p>
+    <w:p>
+      <w:pPr>
+        <w:tabs>
+          <w:tab w:val="left" w:pos="1152"/>
+        </w:tabs>
+        <w:rPr>
+          <w:rFonts w:ascii="Times New Roman" w:eastAsia="Times New Roman" w:hAnsi="Times New Roman" w:cs="Times New Roman"/>
+          <w:lang w:eastAsia="es-SV"/>
+        </w:rPr>
+      </w:pPr>
+    </w:p>
+    <w:p>
+      <w:pPr>
+        <w:tabs>
+          <w:tab w:val="left" w:pos="1152"/>
+        </w:tabs>
+        <w:rPr>
+          <w:rFonts w:ascii="Times New Roman" w:eastAsia="Times New Roman" w:hAnsi="Times New Roman" w:cs="Times New Roman"/>
+          <w:lang w:eastAsia="es-SV"/>
+        </w:rPr>
+      </w:pPr>
+    </w:p>
+    <w:p>
+      <w:pPr>
+        <w:tabs>
+          <w:tab w:val="left" w:pos="1152"/>
+        </w:tabs>
+        <w:rPr>
+          <w:rFonts w:ascii="Times New Roman" w:eastAsia="Times New Roman" w:hAnsi="Times New Roman" w:cs="Times New Roman"/>
+          <w:lang w:eastAsia="es-SV"/>
+        </w:rPr>
+      </w:pPr>
+    </w:p>
+    <w:p>
+      <w:pPr>
+        <w:tabs>
+          <w:tab w:val="left" w:pos="1152"/>
+        </w:tabs>
+        <w:rPr>
+          <w:rFonts w:ascii="Times New Roman" w:eastAsia="Times New Roman" w:hAnsi="Times New Roman" w:cs="Times New Roman"/>
+          <w:lang w:eastAsia="es-SV"/>
+        </w:rPr>
+      </w:pPr>
+    </w:p>
+    <w:p>
+      <w:pPr>
+        <w:tabs>
+          <w:tab w:val="left" w:pos="1152"/>
+        </w:tabs>
+        <w:rPr>
+          <w:rFonts w:ascii="Times New Roman" w:eastAsia="Times New Roman" w:hAnsi="Times New Roman" w:cs="Times New Roman"/>
+          <w:lang w:eastAsia="es-SV"/>
+        </w:rPr>
+      </w:pPr>
+    </w:p>
+    <w:p>
+      <w:pPr>
+        <w:tabs>
+          <w:tab w:val="left" w:pos="1152"/>
+        </w:tabs>
+        <w:rPr>
+          <w:rFonts w:ascii="Times New Roman" w:eastAsia="Times New Roman" w:hAnsi="Times New Roman" w:cs="Times New Roman"/>
+          <w:lang w:eastAsia="es-SV"/>
+        </w:rPr>
+      </w:pPr>
+    </w:p>
+    <w:p>
+      <w:pPr>
+        <w:tabs>
+          <w:tab w:val="left" w:pos="1152"/>
+        </w:tabs>
+        <w:rPr>
+          <w:b/>
+          <w:bCs/>
+          <w:lang w:eastAsia="es-SV"/>
+        </w:rPr>
+      </w:pPr>
+      <w:r>
+        <w:rPr>
+          <w:rFonts w:ascii="Times New Roman" w:eastAsia="Times New Roman" w:hAnsi="Times New Roman" w:cs="Times New Roman"/>
+          <w:b/>
+          <w:bCs/>
+          <w:lang w:eastAsia="es-SV"/>
+        </w:rPr>
+        <w:lastRenderedPageBreak/>
+        <w:t>FIJACIÓN PERSISTENTE DEL PANEL FINANCIERO (STICKY SIDEBAR)</w:t>
+      </w:r>
+    </w:p>
+    <w:p>
+      <w:pPr>
+        <w:tabs>
+          <w:tab w:val="left" w:pos="1152"/>
+        </w:tabs>
+        <w:rPr>
+          <w:rFonts w:ascii="Times New Roman" w:eastAsia="Times New Roman" w:hAnsi="Times New Roman" w:cs="Times New Roman"/>
+          <w:lang w:eastAsia="es-SV"/>
+        </w:rPr>
+      </w:pPr>
+      <w:r>
+        <w:rPr>
+          <w:rFonts w:ascii="Times New Roman" w:eastAsia="Times New Roman" w:hAnsi="Times New Roman" w:cs="Times New Roman"/>
+          <w:lang w:eastAsia="es-SV"/>
+        </w:rPr>
+        <w:t xml:space="preserve">me fije que pusiste "position: </w:t>
+      </w:r>
+      <w:proofErr w:type="spellStart"/>
+      <w:r>
+        <w:rPr>
+          <w:rFonts w:ascii="Times New Roman" w:eastAsia="Times New Roman" w:hAnsi="Times New Roman" w:cs="Times New Roman"/>
+          <w:lang w:eastAsia="es-SV"/>
+        </w:rPr>
+        <w:t>sticky</w:t>
+      </w:r>
+      <w:proofErr w:type="spellEnd"/>
+      <w:r>
+        <w:rPr>
+          <w:rFonts w:ascii="Times New Roman" w:eastAsia="Times New Roman" w:hAnsi="Times New Roman" w:cs="Times New Roman"/>
+          <w:lang w:eastAsia="es-SV"/>
+        </w:rPr>
+        <w:t xml:space="preserve">" en la caja del total del carrito. Explicame bien cómo funciona eso porque cuando yo bajo en el </w:t>
+      </w:r>
+      <w:proofErr w:type="spellStart"/>
+      <w:r>
+        <w:rPr>
+          <w:rFonts w:ascii="Times New Roman" w:eastAsia="Times New Roman" w:hAnsi="Times New Roman" w:cs="Times New Roman"/>
+          <w:lang w:eastAsia="es-SV"/>
+        </w:rPr>
+        <w:t>scroll</w:t>
+      </w:r>
+      <w:proofErr w:type="spellEnd"/>
+      <w:r>
+        <w:rPr>
+          <w:rFonts w:ascii="Times New Roman" w:eastAsia="Times New Roman" w:hAnsi="Times New Roman" w:cs="Times New Roman"/>
+          <w:lang w:eastAsia="es-SV"/>
+        </w:rPr>
+        <w:t xml:space="preserve"> quiero que esa caja se quede pegada y me siga todo el camino sin tapar el </w:t>
+      </w:r>
+      <w:proofErr w:type="spellStart"/>
+      <w:r>
+        <w:rPr>
+          <w:rFonts w:ascii="Times New Roman" w:eastAsia="Times New Roman" w:hAnsi="Times New Roman" w:cs="Times New Roman"/>
+          <w:lang w:eastAsia="es-SV"/>
+        </w:rPr>
+        <w:t>footer</w:t>
+      </w:r>
+      <w:proofErr w:type="spellEnd"/>
+      <w:r>
+        <w:rPr>
+          <w:rFonts w:ascii="Times New Roman" w:eastAsia="Times New Roman" w:hAnsi="Times New Roman" w:cs="Times New Roman"/>
+          <w:lang w:eastAsia="es-SV"/>
+        </w:rPr>
+        <w:t>. ¿Qué reglas hay que respetar?</w:t>
+      </w:r>
+    </w:p>
+    <w:p>
+      <w:pPr>
+        <w:tabs>
+          <w:tab w:val="left" w:pos="1152"/>
+        </w:tabs>
+        <w:rPr>
+          <w:rFonts w:ascii="Times New Roman" w:eastAsia="Times New Roman" w:hAnsi="Times New Roman" w:cs="Times New Roman"/>
+          <w:lang w:eastAsia="es-SV"/>
+        </w:rPr>
+      </w:pPr>
+    </w:p>
+    <w:p>
+      <w:pPr>
+        <w:tabs>
+          <w:tab w:val="left" w:pos="1152"/>
+        </w:tabs>
+        <w:rPr>
+          <w:rFonts w:ascii="Times New Roman" w:eastAsia="Times New Roman" w:hAnsi="Times New Roman" w:cs="Times New Roman"/>
+          <w:lang w:eastAsia="es-SV"/>
+        </w:rPr>
+      </w:pPr>
+      <w:r>
+        <w:rPr>
+          <w:rFonts w:ascii="Times New Roman" w:eastAsia="Times New Roman" w:hAnsi="Times New Roman" w:cs="Times New Roman"/>
+          <w:lang w:eastAsia="es-SV"/>
+        </w:rPr>
+        <w:drawing>
+          <wp:anchor distT="0" distB="0" distL="114300" distR="114300" simplePos="0" relativeHeight="251666432" behindDoc="1" locked="0" layoutInCell="1" allowOverlap="1" wp14:anchorId="07E9673A" wp14:editId="03636C28">
+            <wp:simplePos x="0" y="0"/>
+            <wp:positionH relativeFrom="margin">
+              <wp:posOffset>-38100</wp:posOffset>
+            </wp:positionH>
+            <wp:positionV relativeFrom="paragraph">
+              <wp:posOffset>142875</wp:posOffset>
+            </wp:positionV>
+            <wp:extent cx="3512820" cy="2121535"/>
+            <wp:effectExtent l="0" t="0" r="0" b="0"/>
+            <wp:wrapTight wrapText="bothSides">
+              <wp:wrapPolygon edited="0">
+                <wp:start x="0" y="0"/>
+                <wp:lineTo x="0" y="21335"/>
+                <wp:lineTo x="21436" y="21335"/>
+                <wp:lineTo x="21436" y="0"/>
+                <wp:lineTo x="0" y="0"/>
+              </wp:wrapPolygon>
+            </wp:wrapTight>
+            <wp:docPr id="1321298260" name="Imagen 1"/>
+            <wp:cNvGraphicFramePr>
+              <a:graphicFrameLocks xmlns:a="http://schemas.openxmlformats.org/drawingml/2006/main" noChangeAspect="1"/>
+            </wp:cNvGraphicFramePr>
+            <a:graphic xmlns:a="http://schemas.openxmlformats.org/drawingml/2006/main">
+              <a:graphicData uri="http://schemas.openxmlformats.org/drawingml/2006/picture">
+                <pic:pic xmlns:pic="http://schemas.openxmlformats.org/drawingml/2006/picture">
+                  <pic:nvPicPr>
+                    <pic:cNvPr id="1321298260" name=""/>
+                    <pic:cNvPicPr/>
+                  </pic:nvPicPr>
+                  <pic:blipFill>
+                    <a:blip r:embed="rId17">
+                      <a:extLst>
+                        <a:ext uri="{28A0092B-C50C-407E-A947-70E740481C1C}">
+                          <a14:useLocalDpi xmlns:a14="http://schemas.microsoft.com/office/drawing/2010/main" val="0"/>
+                        </a:ext>
+                      </a:extLst>
+                    </a:blip>
+                    <a:stretch>
+                      <a:fillRect/>
+                    </a:stretch>
+                  </pic:blipFill>
+                  <pic:spPr>
+                    <a:xfrm>
+                      <a:off x="0" y="0"/>
+                      <a:ext cx="3512820" cy="2121535"/>
+                    </a:xfrm>
+                    <a:prstGeom prst="rect">
+                      <a:avLst/>
+                    </a:prstGeom>
+                  </pic:spPr>
+                </pic:pic>
+              </a:graphicData>
+            </a:graphic>
+            <wp14:sizeRelH relativeFrom="margin">
+              <wp14:pctWidth>0</wp14:pctWidth>
+            </wp14:sizeRelH>
+            <wp14:sizeRelV relativeFrom="margin">
+              <wp14:pctHeight>0</wp14:pctHeight>
+            </wp14:sizeRelV>
+          </wp:anchor>
+        </w:drawing>
+      </w:r>
+    </w:p>
+    <w:p>
+      <w:pPr>
+        <w:tabs>
+          <w:tab w:val="left" w:pos="1152"/>
+        </w:tabs>
+        <w:rPr>
+          <w:rFonts w:ascii="Times New Roman" w:eastAsia="Times New Roman" w:hAnsi="Times New Roman" w:cs="Times New Roman"/>
+          <w:lang w:eastAsia="es-SV"/>
+        </w:rPr>
+      </w:pPr>
+    </w:p>
+    <w:p>
+      <w:pPr>
+        <w:tabs>
+          <w:tab w:val="left" w:pos="1152"/>
+        </w:tabs>
+        <w:rPr>
+          <w:rFonts w:ascii="Times New Roman" w:eastAsia="Times New Roman" w:hAnsi="Times New Roman" w:cs="Times New Roman"/>
+          <w:lang w:eastAsia="es-SV"/>
+        </w:rPr>
+      </w:pPr>
+    </w:p>
+    <w:p>
+      <w:pPr>
+        <w:tabs>
+          <w:tab w:val="left" w:pos="1152"/>
+        </w:tabs>
+        <w:rPr>
+          <w:rFonts w:ascii="Times New Roman" w:eastAsia="Times New Roman" w:hAnsi="Times New Roman" w:cs="Times New Roman"/>
+          <w:lang w:eastAsia="es-SV"/>
+        </w:rPr>
+      </w:pPr>
+    </w:p>
+    <w:p>
+      <w:pPr>
+        <w:tabs>
+          <w:tab w:val="left" w:pos="1152"/>
+        </w:tabs>
+        <w:rPr>
+          <w:rFonts w:ascii="Times New Roman" w:eastAsia="Times New Roman" w:hAnsi="Times New Roman" w:cs="Times New Roman"/>
+          <w:lang w:eastAsia="es-SV"/>
+        </w:rPr>
+      </w:pPr>
+    </w:p>
+    <w:p>
+      <w:pPr>
+        <w:tabs>
+          <w:tab w:val="left" w:pos="1152"/>
+        </w:tabs>
+        <w:rPr>
+          <w:rFonts w:ascii="Times New Roman" w:eastAsia="Times New Roman" w:hAnsi="Times New Roman" w:cs="Times New Roman"/>
+          <w:lang w:eastAsia="es-SV"/>
+        </w:rPr>
+      </w:pPr>
+    </w:p>
+    <w:p>
+      <w:pPr>
+        <w:rPr>
+          <w:rFonts w:ascii="Times New Roman" w:eastAsia="Times New Roman" w:hAnsi="Times New Roman" w:cs="Times New Roman"/>
+          <w:lang w:eastAsia="es-SV"/>
+        </w:rPr>
+      </w:pPr>
+    </w:p>
+    <w:p>
+      <w:pPr>
+        <w:rPr>
+          <w:rFonts w:ascii="Times New Roman" w:eastAsia="Times New Roman" w:hAnsi="Times New Roman" w:cs="Times New Roman"/>
+          <w:lang w:eastAsia="es-SV"/>
+        </w:rPr>
+      </w:pPr>
+    </w:p>
+    <w:p>
+      <w:pPr>
+        <w:tabs>
+          <w:tab w:val="left" w:pos="3624"/>
+        </w:tabs>
+        <w:rPr>
+          <w:rFonts w:eastAsia="Times New Roman"/>
+          <w:lang w:eastAsia="es-SV"/>
+        </w:rPr>
+      </w:pPr>
+      <w:r>
+        <w:rPr>
+          <w:rFonts w:eastAsia="Times New Roman"/>
+          <w:lang w:eastAsia="es-SV"/>
+        </w:rPr>
+        <w:t xml:space="preserve">• </w:t>
+      </w:r>
+      <w:r>
+        <w:rPr>
+          <w:rFonts w:eastAsia="Times New Roman"/>
+          <w:b/>
+          <w:bCs/>
+          <w:lang w:eastAsia="es-SV"/>
+        </w:rPr>
+        <w:t>Resultado aplicado o adaptado en el proyecto:</w:t>
+      </w:r>
+      <w:r>
+        <w:rPr>
+          <w:rFonts w:eastAsia="Times New Roman"/>
+          <w:lang w:eastAsia="es-SV"/>
+        </w:rPr>
+        <w:t xml:space="preserve"> Implementación del panel de facturación persistente en la interfaz del carrito de compras. Al verificarlo con múltiples productos listados, el bloque lateral del resumen financiero se desplaza suavemente manteniéndose fijo en la pantalla, y se detiene automáticamente en seco al llegar al tope superior del </w:t>
+      </w:r>
+      <w:proofErr w:type="spellStart"/>
+      <w:r>
+        <w:rPr>
+          <w:rFonts w:eastAsia="Times New Roman"/>
+          <w:lang w:eastAsia="es-SV"/>
+        </w:rPr>
+        <w:t>footer</w:t>
+      </w:r>
+      <w:proofErr w:type="spellEnd"/>
+      <w:r>
+        <w:rPr>
+          <w:rFonts w:eastAsia="Times New Roman"/>
+          <w:lang w:eastAsia="es-SV"/>
+        </w:rPr>
+        <w:t xml:space="preserve"> largo.</w:t>
+      </w:r>
+    </w:p>
+    <w:p>
+      <w:pPr>
+        <w:tabs>
+          <w:tab w:val="left" w:pos="3624"/>
+        </w:tabs>
+        <w:rPr>
+          <w:rFonts w:ascii="Times New Roman" w:eastAsia="Times New Roman" w:hAnsi="Times New Roman" w:cs="Times New Roman"/>
+          <w:lang w:eastAsia="es-SV"/>
+        </w:rPr>
+      </w:pPr>
+      <w:r>
+        <w:rPr>
+          <w:rFonts w:ascii="Times New Roman" w:eastAsia="Times New Roman" w:hAnsi="Times New Roman" w:cs="Times New Roman"/>
+          <w:lang w:eastAsia="es-SV"/>
+        </w:rPr>
+        <w:t xml:space="preserve">• </w:t>
+      </w:r>
+      <w:r>
+        <w:rPr>
+          <w:rFonts w:ascii="Times New Roman" w:eastAsia="Times New Roman" w:hAnsi="Times New Roman" w:cs="Times New Roman"/>
+          <w:b/>
+          <w:bCs/>
+          <w:lang w:eastAsia="es-SV"/>
+        </w:rPr>
+        <w:t>Explicación breve del aporte de la IA en el proceso de desarrollo:</w:t>
+      </w:r>
+      <w:r>
+        <w:rPr>
+          <w:rFonts w:ascii="Times New Roman" w:eastAsia="Times New Roman" w:hAnsi="Times New Roman" w:cs="Times New Roman"/>
+          <w:lang w:eastAsia="es-SV"/>
+        </w:rPr>
+        <w:t xml:space="preserve"> Aportó conocimientos críticos de diagramación avanzada (</w:t>
+      </w:r>
+      <w:proofErr w:type="spellStart"/>
+      <w:r>
+        <w:rPr>
+          <w:rFonts w:ascii="Times New Roman" w:eastAsia="Times New Roman" w:hAnsi="Times New Roman" w:cs="Times New Roman"/>
+          <w:lang w:eastAsia="es-SV"/>
+        </w:rPr>
+        <w:t>Sticky</w:t>
+      </w:r>
+      <w:proofErr w:type="spellEnd"/>
+      <w:r>
+        <w:rPr>
+          <w:rFonts w:ascii="Times New Roman" w:eastAsia="Times New Roman" w:hAnsi="Times New Roman" w:cs="Times New Roman"/>
+          <w:lang w:eastAsia="es-SV"/>
+        </w:rPr>
+        <w:t xml:space="preserve"> </w:t>
+      </w:r>
+      <w:proofErr w:type="spellStart"/>
+      <w:r>
+        <w:rPr>
+          <w:rFonts w:ascii="Times New Roman" w:eastAsia="Times New Roman" w:hAnsi="Times New Roman" w:cs="Times New Roman"/>
+          <w:lang w:eastAsia="es-SV"/>
+        </w:rPr>
+        <w:t>Scrolling</w:t>
+      </w:r>
+      <w:proofErr w:type="spellEnd"/>
+      <w:r>
+        <w:rPr>
+          <w:rFonts w:ascii="Times New Roman" w:eastAsia="Times New Roman" w:hAnsi="Times New Roman" w:cs="Times New Roman"/>
+          <w:lang w:eastAsia="es-SV"/>
+        </w:rPr>
+        <w:t xml:space="preserve"> </w:t>
+      </w:r>
+      <w:proofErr w:type="spellStart"/>
+      <w:r>
+        <w:rPr>
+          <w:rFonts w:ascii="Times New Roman" w:eastAsia="Times New Roman" w:hAnsi="Times New Roman" w:cs="Times New Roman"/>
+          <w:lang w:eastAsia="es-SV"/>
+        </w:rPr>
+        <w:t>Mechanics</w:t>
+      </w:r>
+      <w:proofErr w:type="spellEnd"/>
+      <w:r>
+        <w:rPr>
+          <w:rFonts w:ascii="Times New Roman" w:eastAsia="Times New Roman" w:hAnsi="Times New Roman" w:cs="Times New Roman"/>
+          <w:lang w:eastAsia="es-SV"/>
+        </w:rPr>
+        <w:t xml:space="preserve">), mejorando la accesibilidad financiera del sitio web al asegurar que el botón de pago final </w:t>
+      </w:r>
+      <w:proofErr w:type="gramStart"/>
+      <w:r>
+        <w:rPr>
+          <w:rFonts w:ascii="Times New Roman" w:eastAsia="Times New Roman" w:hAnsi="Times New Roman" w:cs="Times New Roman"/>
+          <w:lang w:eastAsia="es-SV"/>
+        </w:rPr>
+        <w:t>(.</w:t>
+      </w:r>
+      <w:proofErr w:type="spellStart"/>
+      <w:r>
+        <w:rPr>
+          <w:rFonts w:ascii="Times New Roman" w:eastAsia="Times New Roman" w:hAnsi="Times New Roman" w:cs="Times New Roman"/>
+          <w:lang w:eastAsia="es-SV"/>
+        </w:rPr>
+        <w:t>btn</w:t>
+      </w:r>
+      <w:proofErr w:type="gramEnd"/>
+      <w:r>
+        <w:rPr>
+          <w:rFonts w:ascii="Times New Roman" w:eastAsia="Times New Roman" w:hAnsi="Times New Roman" w:cs="Times New Roman"/>
+          <w:lang w:eastAsia="es-SV"/>
+        </w:rPr>
+        <w:t>-checkout</w:t>
+      </w:r>
+      <w:proofErr w:type="spellEnd"/>
+      <w:r>
+        <w:rPr>
+          <w:rFonts w:ascii="Times New Roman" w:eastAsia="Times New Roman" w:hAnsi="Times New Roman" w:cs="Times New Roman"/>
+          <w:lang w:eastAsia="es-SV"/>
+        </w:rPr>
+        <w:t>) esté permanentemente al alcance visual del consumidor.</w:t>
+      </w:r>
+    </w:p>
+    <w:p>
+      <w:pPr>
+        <w:tabs>
+          <w:tab w:val="left" w:pos="3624"/>
+        </w:tabs>
+        <w:rPr>
+          <w:rFonts w:ascii="Times New Roman" w:eastAsia="Times New Roman" w:hAnsi="Times New Roman" w:cs="Times New Roman"/>
+          <w:b/>
+          <w:bCs/>
+          <w:lang w:eastAsia="es-SV"/>
+        </w:rPr>
+      </w:pPr>
+    </w:p>
+    <w:p>
+      <w:pPr>
+        <w:tabs>
+          <w:tab w:val="left" w:pos="3624"/>
+        </w:tabs>
+        <w:rPr>
+          <w:rFonts w:ascii="Times New Roman" w:eastAsia="Times New Roman" w:hAnsi="Times New Roman" w:cs="Times New Roman"/>
+          <w:b/>
+          <w:bCs/>
+          <w:lang w:eastAsia="es-SV"/>
+        </w:rPr>
+      </w:pPr>
+      <w:r>
+        <w:rPr>
+          <w:rFonts w:ascii="Times New Roman" w:eastAsia="Times New Roman" w:hAnsi="Times New Roman" w:cs="Times New Roman"/>
+          <w:b/>
+          <w:bCs/>
+          <w:lang w:eastAsia="es-SV"/>
+        </w:rPr>
+        <w:t>BOTONES DE CANTIDAD MODULARES (+/-) EN LA FILA DEL CARRITO</w:t>
+      </w:r>
+    </w:p>
+    <w:p>
+      <w:pPr>
+        <w:rPr>
+          <w:rFonts w:ascii="Times New Roman" w:eastAsia="Times New Roman" w:hAnsi="Times New Roman" w:cs="Times New Roman"/>
+          <w:lang w:eastAsia="es-SV"/>
+        </w:rPr>
+      </w:pPr>
+      <w:r>
+        <w:rPr>
+          <w:rFonts w:ascii="Times New Roman" w:eastAsia="Times New Roman" w:hAnsi="Times New Roman" w:cs="Times New Roman"/>
+          <w:lang w:eastAsia="es-SV"/>
+        </w:rPr>
+        <w:t xml:space="preserve">Bro, </w:t>
+      </w:r>
+      <w:proofErr w:type="spellStart"/>
+      <w:r>
+        <w:rPr>
+          <w:rFonts w:ascii="Times New Roman" w:eastAsia="Times New Roman" w:hAnsi="Times New Roman" w:cs="Times New Roman"/>
+          <w:lang w:eastAsia="es-SV"/>
+        </w:rPr>
+        <w:t>explicame</w:t>
+      </w:r>
+      <w:proofErr w:type="spellEnd"/>
+      <w:r>
+        <w:rPr>
+          <w:rFonts w:ascii="Times New Roman" w:eastAsia="Times New Roman" w:hAnsi="Times New Roman" w:cs="Times New Roman"/>
+          <w:lang w:eastAsia="es-SV"/>
+        </w:rPr>
+        <w:t xml:space="preserve"> cómo </w:t>
+      </w:r>
+      <w:proofErr w:type="spellStart"/>
+      <w:r>
+        <w:rPr>
+          <w:rFonts w:ascii="Times New Roman" w:eastAsia="Times New Roman" w:hAnsi="Times New Roman" w:cs="Times New Roman"/>
+          <w:lang w:eastAsia="es-SV"/>
+        </w:rPr>
+        <w:t>armás</w:t>
+      </w:r>
+      <w:proofErr w:type="spellEnd"/>
+      <w:r>
+        <w:rPr>
+          <w:rFonts w:ascii="Times New Roman" w:eastAsia="Times New Roman" w:hAnsi="Times New Roman" w:cs="Times New Roman"/>
+          <w:lang w:eastAsia="es-SV"/>
+        </w:rPr>
+        <w:t xml:space="preserve"> los botoncitos de sumar y restar comida en el carrito para que queden bien cuadrados y alineados en medio de la fila. </w:t>
+      </w:r>
+      <w:proofErr w:type="spellStart"/>
+      <w:r>
+        <w:rPr>
+          <w:rFonts w:ascii="Times New Roman" w:eastAsia="Times New Roman" w:hAnsi="Times New Roman" w:cs="Times New Roman"/>
+          <w:lang w:eastAsia="es-SV"/>
+        </w:rPr>
+        <w:t>Pasame</w:t>
+      </w:r>
+      <w:proofErr w:type="spellEnd"/>
+      <w:r>
+        <w:rPr>
+          <w:rFonts w:ascii="Times New Roman" w:eastAsia="Times New Roman" w:hAnsi="Times New Roman" w:cs="Times New Roman"/>
+          <w:lang w:eastAsia="es-SV"/>
+        </w:rPr>
+        <w:t xml:space="preserve"> ese pedazo de código para meterlo ya en el HTML.</w:t>
+      </w:r>
+    </w:p>
+    <w:p>
+      <w:pPr>
+        <w:rPr>
+          <w:rFonts w:ascii="Times New Roman" w:eastAsia="Times New Roman" w:hAnsi="Times New Roman" w:cs="Times New Roman"/>
+          <w:lang w:eastAsia="es-SV"/>
+        </w:rPr>
+      </w:pPr>
+      <w:r>
+        <w:rPr>
+          <w:rFonts w:ascii="Times New Roman" w:eastAsia="Times New Roman" w:hAnsi="Times New Roman" w:cs="Times New Roman"/>
+          <w:b/>
+          <w:bCs/>
+          <w:lang w:eastAsia="es-SV"/>
+        </w:rPr>
+        <w:t>Respuesta generada por la IA:</w:t>
+      </w:r>
+      <w:r>
+        <w:rPr>
+          <w:rFonts w:ascii="Times New Roman" w:eastAsia="Times New Roman" w:hAnsi="Times New Roman" w:cs="Times New Roman"/>
+          <w:lang w:eastAsia="es-SV"/>
+        </w:rPr>
+        <w:t xml:space="preserve"> Maquetación de </w:t>
+      </w:r>
+      <w:proofErr w:type="spellStart"/>
+      <w:proofErr w:type="gramStart"/>
+      <w:r>
+        <w:rPr>
+          <w:rFonts w:ascii="Times New Roman" w:eastAsia="Times New Roman" w:hAnsi="Times New Roman" w:cs="Times New Roman"/>
+          <w:lang w:eastAsia="es-SV"/>
+        </w:rPr>
+        <w:t>micro-componentes</w:t>
+      </w:r>
+      <w:proofErr w:type="spellEnd"/>
+      <w:proofErr w:type="gramEnd"/>
+      <w:r>
+        <w:rPr>
+          <w:rFonts w:ascii="Times New Roman" w:eastAsia="Times New Roman" w:hAnsi="Times New Roman" w:cs="Times New Roman"/>
+          <w:lang w:eastAsia="es-SV"/>
+        </w:rPr>
+        <w:t xml:space="preserve"> de control numérico empleando alineaciones verticales compactas en </w:t>
+      </w:r>
+      <w:proofErr w:type="spellStart"/>
+      <w:r>
+        <w:rPr>
+          <w:rFonts w:ascii="Times New Roman" w:eastAsia="Times New Roman" w:hAnsi="Times New Roman" w:cs="Times New Roman"/>
+          <w:lang w:eastAsia="es-SV"/>
+        </w:rPr>
+        <w:t>Flexbox</w:t>
+      </w:r>
+      <w:proofErr w:type="spellEnd"/>
+      <w:r>
+        <w:rPr>
+          <w:rFonts w:ascii="Times New Roman" w:eastAsia="Times New Roman" w:hAnsi="Times New Roman" w:cs="Times New Roman"/>
+          <w:lang w:eastAsia="es-SV"/>
+        </w:rPr>
+        <w:t>:</w:t>
+      </w:r>
+    </w:p>
+    <w:p>
+      <w:pPr>
+        <w:rPr>
+          <w:rFonts w:ascii="Times New Roman" w:eastAsia="Times New Roman" w:hAnsi="Times New Roman" w:cs="Times New Roman"/>
+          <w:lang w:eastAsia="es-SV"/>
+        </w:rPr>
+      </w:pPr>
+      <w:r>
+        <w:rPr>
+          <w:rFonts w:ascii="Times New Roman" w:eastAsia="Times New Roman" w:hAnsi="Times New Roman" w:cs="Times New Roman"/>
+          <w:lang w:eastAsia="es-SV"/>
+        </w:rPr>
+        <w:lastRenderedPageBreak/>
+        <w:drawing>
+          <wp:anchor distT="0" distB="0" distL="114300" distR="114300" simplePos="0" relativeHeight="251667456" behindDoc="1" locked="0" layoutInCell="1" allowOverlap="1" wp14:anchorId="2FF7369D" wp14:editId="69CECAF8">
+            <wp:simplePos x="0" y="0"/>
+            <wp:positionH relativeFrom="margin">
+              <wp:posOffset>3194685</wp:posOffset>
+            </wp:positionH>
+            <wp:positionV relativeFrom="paragraph">
+              <wp:posOffset>6985</wp:posOffset>
+            </wp:positionV>
+            <wp:extent cx="2087880" cy="2357755"/>
+            <wp:effectExtent l="0" t="0" r="7620" b="4445"/>
+            <wp:wrapTight wrapText="bothSides">
+              <wp:wrapPolygon edited="0">
+                <wp:start x="0" y="0"/>
+                <wp:lineTo x="0" y="21466"/>
+                <wp:lineTo x="21482" y="21466"/>
+                <wp:lineTo x="21482" y="0"/>
+                <wp:lineTo x="0" y="0"/>
+              </wp:wrapPolygon>
+            </wp:wrapTight>
+            <wp:docPr id="1513384305" name="Imagen 1"/>
+            <wp:cNvGraphicFramePr>
+              <a:graphicFrameLocks xmlns:a="http://schemas.openxmlformats.org/drawingml/2006/main" noChangeAspect="1"/>
+            </wp:cNvGraphicFramePr>
+            <a:graphic xmlns:a="http://schemas.openxmlformats.org/drawingml/2006/main">
+              <a:graphicData uri="http://schemas.openxmlformats.org/drawingml/2006/picture">
+                <pic:pic xmlns:pic="http://schemas.openxmlformats.org/drawingml/2006/picture">
+                  <pic:nvPicPr>
+                    <pic:cNvPr id="1513384305" name=""/>
+                    <pic:cNvPicPr/>
+                  </pic:nvPicPr>
+                  <pic:blipFill>
+                    <a:blip r:embed="rId18">
+                      <a:extLst>
+                        <a:ext uri="{28A0092B-C50C-407E-A947-70E740481C1C}">
+                          <a14:useLocalDpi xmlns:a14="http://schemas.microsoft.com/office/drawing/2010/main" val="0"/>
+                        </a:ext>
+                      </a:extLst>
+                    </a:blip>
+                    <a:stretch>
+                      <a:fillRect/>
+                    </a:stretch>
+                  </pic:blipFill>
+                  <pic:spPr>
+                    <a:xfrm>
+                      <a:off x="0" y="0"/>
+                      <a:ext cx="2087880" cy="2357755"/>
+                    </a:xfrm>
+                    <a:prstGeom prst="rect">
+                      <a:avLst/>
+                    </a:prstGeom>
+                  </pic:spPr>
+                </pic:pic>
+              </a:graphicData>
+            </a:graphic>
+            <wp14:sizeRelH relativeFrom="margin">
+              <wp14:pctWidth>0</wp14:pctWidth>
+            </wp14:sizeRelH>
+            <wp14:sizeRelV relativeFrom="margin">
+              <wp14:pctHeight>0</wp14:pctHeight>
+            </wp14:sizeRelV>
+          </wp:anchor>
+        </w:drawing>
+      </w:r>
+      <w:r>
+        <w:rPr>
+          <w:rFonts w:ascii="Times New Roman" w:eastAsia="Times New Roman" w:hAnsi="Times New Roman" w:cs="Times New Roman"/>
+          <w:lang w:eastAsia="es-SV"/>
+        </w:rPr>
+        <w:drawing>
+          <wp:inline distT="0" distB="0" distL="0" distR="0" wp14:anchorId="70B04C68" wp14:editId="37F1A237">
+            <wp:extent cx="2446020" cy="2478678"/>
+            <wp:effectExtent l="0" t="0" r="0" b="0"/>
+            <wp:docPr id="1374347980" name="Imagen 1"/>
+            <wp:cNvGraphicFramePr>
+              <a:graphicFrameLocks xmlns:a="http://schemas.openxmlformats.org/drawingml/2006/main" noChangeAspect="1"/>
+            </wp:cNvGraphicFramePr>
+            <a:graphic xmlns:a="http://schemas.openxmlformats.org/drawingml/2006/main">
+              <a:graphicData uri="http://schemas.openxmlformats.org/drawingml/2006/picture">
+                <pic:pic xmlns:pic="http://schemas.openxmlformats.org/drawingml/2006/picture">
+                  <pic:nvPicPr>
+                    <pic:cNvPr id="1374347980" name=""/>
+                    <pic:cNvPicPr/>
+                  </pic:nvPicPr>
+                  <pic:blipFill>
+                    <a:blip r:embed="rId19"/>
+                    <a:stretch>
+                      <a:fillRect/>
+                    </a:stretch>
+                  </pic:blipFill>
+                  <pic:spPr>
+                    <a:xfrm>
+                      <a:off x="0" y="0"/>
+                      <a:ext cx="2452469" cy="2485213"/>
+                    </a:xfrm>
+                    <a:prstGeom prst="rect">
+                      <a:avLst/>
+                    </a:prstGeom>
+                  </pic:spPr>
+                </pic:pic>
+              </a:graphicData>
+            </a:graphic>
+          </wp:inline>
+        </w:drawing>
+      </w:r>
+    </w:p>
+    <w:p>
+      <w:pPr>
+        <w:rPr>
+          <w:rFonts w:ascii="Times New Roman" w:eastAsia="Times New Roman" w:hAnsi="Times New Roman" w:cs="Times New Roman"/>
+          <w:lang w:eastAsia="es-SV"/>
+        </w:rPr>
+      </w:pPr>
+      <w:r>
+        <w:rPr>
+          <w:rFonts w:ascii="Times New Roman" w:eastAsia="Times New Roman" w:hAnsi="Times New Roman" w:cs="Times New Roman"/>
+          <w:lang w:eastAsia="es-SV"/>
+        </w:rPr>
+        <w:t xml:space="preserve">• </w:t>
+      </w:r>
+      <w:r>
+        <w:rPr>
+          <w:rFonts w:ascii="Times New Roman" w:eastAsia="Times New Roman" w:hAnsi="Times New Roman" w:cs="Times New Roman"/>
+          <w:b/>
+          <w:bCs/>
+          <w:lang w:eastAsia="es-SV"/>
+        </w:rPr>
+        <w:t>Resultado aplicado o adaptado en el proyecto:</w:t>
+      </w:r>
+      <w:r>
+        <w:rPr>
+          <w:rFonts w:ascii="Times New Roman" w:eastAsia="Times New Roman" w:hAnsi="Times New Roman" w:cs="Times New Roman"/>
+          <w:lang w:eastAsia="es-SV"/>
+        </w:rPr>
+        <w:t xml:space="preserve"> Integración de los controles interactivos dentro de la columna central de cada producto del carrito. Los botones lucen geométricamente simétricos (cuadrados perfectos de 32px), facilitando la simulación del aumento o disminución de porciones del platillo.</w:t>
+      </w:r>
+    </w:p>
+    <w:p>
+      <w:pPr>
+        <w:rPr>
+          <w:rFonts w:ascii="Times New Roman" w:eastAsia="Times New Roman" w:hAnsi="Times New Roman" w:cs="Times New Roman"/>
+          <w:lang w:eastAsia="es-SV"/>
+        </w:rPr>
+      </w:pPr>
+      <w:r>
+        <w:rPr>
+          <w:rFonts w:ascii="Times New Roman" w:eastAsia="Times New Roman" w:hAnsi="Times New Roman" w:cs="Times New Roman"/>
+          <w:lang w:eastAsia="es-SV"/>
+        </w:rPr>
+        <w:t xml:space="preserve">• </w:t>
+      </w:r>
+      <w:r>
+        <w:rPr>
+          <w:rFonts w:ascii="Times New Roman" w:eastAsia="Times New Roman" w:hAnsi="Times New Roman" w:cs="Times New Roman"/>
+          <w:b/>
+          <w:bCs/>
+          <w:lang w:eastAsia="es-SV"/>
+        </w:rPr>
+        <w:t>Explicación breve del aporte de la IA en el proceso de desarrollo:</w:t>
+      </w:r>
+      <w:r>
+        <w:rPr>
+          <w:rFonts w:ascii="Times New Roman" w:eastAsia="Times New Roman" w:hAnsi="Times New Roman" w:cs="Times New Roman"/>
+          <w:lang w:eastAsia="es-SV"/>
+        </w:rPr>
+        <w:t xml:space="preserve"> Resolvió la maquetación detallada de elementos de control de interfaz de usuario, garantizando un centrado perfecto de caracteres icónicos (+ y -) mediante la combinación de dimensiones fijas y alineaciones </w:t>
+      </w:r>
+      <w:proofErr w:type="spellStart"/>
+      <w:r>
+        <w:rPr>
+          <w:rFonts w:ascii="Times New Roman" w:eastAsia="Times New Roman" w:hAnsi="Times New Roman" w:cs="Times New Roman"/>
+          <w:lang w:eastAsia="es-SV"/>
+        </w:rPr>
+        <w:t>Flexbox</w:t>
+      </w:r>
+      <w:proofErr w:type="spellEnd"/>
+      <w:r>
+        <w:rPr>
+          <w:rFonts w:ascii="Times New Roman" w:eastAsia="Times New Roman" w:hAnsi="Times New Roman" w:cs="Times New Roman"/>
+          <w:lang w:eastAsia="es-SV"/>
+        </w:rPr>
+        <w:t xml:space="preserve"> (</w:t>
+      </w:r>
+      <w:proofErr w:type="spellStart"/>
+      <w:r>
+        <w:rPr>
+          <w:rFonts w:ascii="Times New Roman" w:eastAsia="Times New Roman" w:hAnsi="Times New Roman" w:cs="Times New Roman"/>
+          <w:lang w:eastAsia="es-SV"/>
+        </w:rPr>
+        <w:t>justify-content</w:t>
+      </w:r>
+      <w:proofErr w:type="spellEnd"/>
+      <w:r>
+        <w:rPr>
+          <w:rFonts w:ascii="Times New Roman" w:eastAsia="Times New Roman" w:hAnsi="Times New Roman" w:cs="Times New Roman"/>
+          <w:lang w:eastAsia="es-SV"/>
+        </w:rPr>
+        <w:t>: center).</w:t>
+      </w:r>
+    </w:p>
+    <w:p>
+      <w:pPr>
+        <w:rPr>
+          <w:rFonts w:ascii="Times New Roman" w:eastAsia="Times New Roman" w:hAnsi="Times New Roman" w:cs="Times New Roman"/>
+          <w:lang w:eastAsia="es-SV"/>
+        </w:rPr>
+      </w:pPr>
+    </w:p>
     <w:sectPr>
       <w:pgSz w:w="12240" w:h="15840"/>
       <w:pgMar w:top="1417" w:right="1701" w:bottom="1417" w:left="1701" w:header="708" w:footer="708" w:gutter="0"/>
@@ -4329,9 +7148,285 @@
 </w:document>
 </file>
 
+<file path=word/endnotes.xml><?xml version="1.0" encoding="utf-8"?>
+<w:endnotes xmlns:wpc="http://schemas.microsoft.com/office/word/2010/wordprocessingCanvas" xmlns:cx="http://schemas.microsoft.com/office/drawing/2014/chartex" xmlns:cx1="http://schemas.microsoft.com/office/drawing/2015/9/8/chartex" xmlns:cx2="http://schemas.microsoft.com/office/drawing/2015/10/21/chartex" xmlns:cx3="http://schemas.microsoft.com/office/drawing/2016/5/9/chartex" xmlns:cx4="http://schemas.microsoft.com/office/drawing/2016/5/10/chartex" xmlns:cx5="http://schemas.microsoft.com/office/drawing/2016/5/11/chartex" xmlns:cx6="http://schemas.microsoft.com/office/drawing/2016/5/12/chartex" xmlns:cx7="http://schemas.microsoft.com/office/drawing/2016/5/13/chartex" xmlns:cx8="http://schemas.microsoft.com/office/drawing/2016/5/14/chartex" xmlns:mc="http://schemas.openxmlformats.org/markup-compatibility/2006" xmlns:aink="http://schemas.microsoft.com/office/drawing/2016/ink" xmlns:am3d="http://schemas.microsoft.com/office/drawing/2017/model3d" xmlns:o="urn:schemas-microsoft-com:office:office" xmlns:oel="http://schemas.microsoft.com/office/2019/extlst" xmlns:r="http://schemas.openxmlformats.org/officeDocument/2006/relationships" xmlns:m="http://schemas.openxmlformats.org/officeDocument/2006/math" xmlns:v="urn:schemas-microsoft-com:vml" xmlns:wp14="http://schemas.microsoft.com/office/word/2010/wordprocessingDrawing" xmlns:wp="http://schemas.openxmlformats.org/drawingml/2006/wordprocessingDrawing" xmlns:w10="urn:schemas-microsoft-com:office:word" xmlns:w="http://schemas.openxmlformats.org/wordprocessingml/2006/main" xmlns:w14="http://schemas.microsoft.com/office/word/2010/wordml" xmlns:w15="http://schemas.microsoft.com/office/word/2012/wordml" xmlns:w16cex="http://schemas.microsoft.com/office/word/2018/wordml/cex" xmlns:w16cid="http://schemas.microsoft.com/office/word/2016/wordml/cid" xmlns:w16="http://schemas.microsoft.com/office/word/2018/wordml" xmlns:w16du="http://schemas.microsoft.com/office/word/2023/wordml/word16du" xmlns:w16sdtdh="http://schemas.microsoft.com/office/word/2020/wordml/sdtdatahash" xmlns:w16sdtfl="http://schemas.microsoft.com/office/word/2024/wordml/sdtformatlock" xmlns:w16se="http://schemas.microsoft.com/office/word/2015/wordml/symex" xmlns:wpg="http://schemas.microsoft.com/office/word/2010/wordprocessingGroup" xmlns:wpi="http://schemas.microsoft.com/office/word/2010/wordprocessingInk" xmlns:wne="http://schemas.microsoft.com/office/word/2006/wordml" xmlns:wps="http://schemas.microsoft.com/office/word/2010/wordprocessingShape" mc:Ignorable="w14 w15 w16se w16cid w16 w16cex w16sdtdh w16sdtfl w16du wp14">
+  <w:endnote w:type="separator" w:id="-1">
+    <w:p>
+      <w:pPr>
+        <w:spacing w:after="0" w:line="240" w:lineRule="auto"/>
+      </w:pPr>
+      <w:r>
+        <w:separator/>
+      </w:r>
+    </w:p>
+  </w:endnote>
+  <w:endnote w:type="continuationSeparator" w:id="0">
+    <w:p>
+      <w:pPr>
+        <w:spacing w:after="0" w:line="240" w:lineRule="auto"/>
+      </w:pPr>
+      <w:r>
+        <w:continuationSeparator/>
+      </w:r>
+    </w:p>
+  </w:endnote>
+</w:endnotes>
+</file>
+
+<file path=word/footnotes.xml><?xml version="1.0" encoding="utf-8"?>
+<w:footnotes xmlns:wpc="http://schemas.microsoft.com/office/word/2010/wordprocessingCanvas" xmlns:cx="http://schemas.microsoft.com/office/drawing/2014/chartex" xmlns:cx1="http://schemas.microsoft.com/office/drawing/2015/9/8/chartex" xmlns:cx2="http://schemas.microsoft.com/office/drawing/2015/10/21/chartex" xmlns:cx3="http://schemas.microsoft.com/office/drawing/2016/5/9/chartex" xmlns:cx4="http://schemas.microsoft.com/office/drawing/2016/5/10/chartex" xmlns:cx5="http://schemas.microsoft.com/office/drawing/2016/5/11/chartex" xmlns:cx6="http://schemas.microsoft.com/office/drawing/2016/5/12/chartex" xmlns:cx7="http://schemas.microsoft.com/office/drawing/2016/5/13/chartex" xmlns:cx8="http://schemas.microsoft.com/office/drawing/2016/5/14/chartex" xmlns:mc="http://schemas.openxmlformats.org/markup-compatibility/2006" xmlns:aink="http://schemas.microsoft.com/office/drawing/2016/ink" xmlns:am3d="http://schemas.microsoft.com/office/drawing/2017/model3d" xmlns:o="urn:schemas-microsoft-com:office:office" xmlns:oel="http://schemas.microsoft.com/office/2019/extlst" xmlns:r="http://schemas.openxmlformats.org/officeDocument/2006/relationships" xmlns:m="http://schemas.openxmlformats.org/officeDocument/2006/math" xmlns:v="urn:schemas-microsoft-com:vml" xmlns:wp14="http://schemas.microsoft.com/office/word/2010/wordprocessingDrawing" xmlns:wp="http://schemas.openxmlformats.org/drawingml/2006/wordprocessingDrawing" xmlns:w10="urn:schemas-microsoft-com:office:word" xmlns:w="http://schemas.openxmlformats.org/wordprocessingml/2006/main" xmlns:w14="http://schemas.microsoft.com/office/word/2010/wordml" xmlns:w15="http://schemas.microsoft.com/office/word/2012/wordml" xmlns:w16cex="http://schemas.microsoft.com/office/word/2018/wordml/cex" xmlns:w16cid="http://schemas.microsoft.com/office/word/2016/wordml/cid" xmlns:w16="http://schemas.microsoft.com/office/word/2018/wordml" xmlns:w16du="http://schemas.microsoft.com/office/word/2023/wordml/word16du" xmlns:w16sdtdh="http://schemas.microsoft.com/office/word/2020/wordml/sdtdatahash" xmlns:w16sdtfl="http://schemas.microsoft.com/office/word/2024/wordml/sdtformatlock" xmlns:w16se="http://schemas.microsoft.com/office/word/2015/wordml/symex" xmlns:wpg="http://schemas.microsoft.com/office/word/2010/wordprocessingGroup" xmlns:wpi="http://schemas.microsoft.com/office/word/2010/wordprocessingInk" xmlns:wne="http://schemas.microsoft.com/office/word/2006/wordml" xmlns:wps="http://schemas.microsoft.com/office/word/2010/wordprocessingShape" mc:Ignorable="w14 w15 w16se w16cid w16 w16cex w16sdtdh w16sdtfl w16du wp14">
+  <w:footnote w:type="separator" w:id="-1">
+    <w:p>
+      <w:pPr>
+        <w:spacing w:after="0" w:line="240" w:lineRule="auto"/>
+      </w:pPr>
+      <w:r>
+        <w:separator/>
+      </w:r>
+    </w:p>
+  </w:footnote>
+  <w:footnote w:type="continuationSeparator" w:id="0">
+    <w:p>
+      <w:pPr>
+        <w:spacing w:after="0" w:line="240" w:lineRule="auto"/>
+      </w:pPr>
+      <w:r>
+        <w:continuationSeparator/>
+      </w:r>
+    </w:p>
+  </w:footnote>
+</w:footnotes>
+</file>
+
 <file path=word/numbering.xml><?xml version="1.0" encoding="utf-8"?>
 <w:numbering xmlns:wpc="http://schemas.microsoft.com/office/word/2010/wordprocessingCanvas" xmlns:cx="http://schemas.microsoft.com/office/drawing/2014/chartex" xmlns:cx1="http://schemas.microsoft.com/office/drawing/2015/9/8/chartex" xmlns:cx2="http://schemas.microsoft.com/office/drawing/2015/10/21/chartex" xmlns:cx3="http://schemas.microsoft.com/office/drawing/2016/5/9/chartex" xmlns:cx4="http://schemas.microsoft.com/office/drawing/2016/5/10/chartex" xmlns:cx5="http://schemas.microsoft.com/office/drawing/2016/5/11/chartex" xmlns:cx6="http://schemas.microsoft.com/office/drawing/2016/5/12/chartex" xmlns:cx7="http://schemas.microsoft.com/office/drawing/2016/5/13/chartex" xmlns:cx8="http://schemas.microsoft.com/office/drawing/2016/5/14/chartex" xmlns:mc="http://schemas.openxmlformats.org/markup-compatibility/2006" xmlns:aink="http://schemas.microsoft.com/office/drawing/2016/ink" xmlns:am3d="http://schemas.microsoft.com/office/drawing/2017/model3d" xmlns:o="urn:schemas-microsoft-com:office:office" xmlns:oel="http://schemas.microsoft.com/office/2019/extlst" xmlns:r="http://schemas.openxmlformats.org/officeDocument/2006/relationships" xmlns:m="http://schemas.openxmlformats.org/officeDocument/2006/math" xmlns:v="urn:schemas-microsoft-com:vml" xmlns:wp14="http://schemas.microsoft.com/office/word/2010/wordprocessingDrawing" xmlns:wp="http://schemas.openxmlformats.org/drawingml/2006/wordprocessingDrawing" xmlns:w10="urn:schemas-microsoft-com:office:word" xmlns:w="http://schemas.openxmlformats.org/wordprocessingml/2006/main" xmlns:w14="http://schemas.microsoft.com/office/word/2010/wordml" xmlns:w15="http://schemas.microsoft.com/office/word/2012/wordml" xmlns:w16cex="http://schemas.microsoft.com/office/word/2018/wordml/cex" xmlns:w16cid="http://schemas.microsoft.com/office/word/2016/wordml/cid" xmlns:w16="http://schemas.microsoft.com/office/word/2018/wordml" xmlns:w16du="http://schemas.microsoft.com/office/word/2023/wordml/word16du" xmlns:w16sdtdh="http://schemas.microsoft.com/office/word/2020/wordml/sdtdatahash" xmlns:w16sdtfl="http://schemas.microsoft.com/office/word/2024/wordml/sdtformatlock" xmlns:w16se="http://schemas.microsoft.com/office/word/2015/wordml/symex" xmlns:wpg="http://schemas.microsoft.com/office/word/2010/wordprocessingGroup" xmlns:wpi="http://schemas.microsoft.com/office/word/2010/wordprocessingInk" xmlns:wne="http://schemas.microsoft.com/office/word/2006/wordml" xmlns:wps="http://schemas.microsoft.com/office/word/2010/wordprocessingShape" mc:Ignorable="w14 w15 w16se w16cid w16 w16cex w16sdtdh w16sdtfl w16du wp14">
   <w:abstractNum w:abstractNumId="0" w15:restartNumberingAfterBreak="0">
+    <w:nsid w:val="002A0433"/>
+    <w:multiLevelType w:val="multilevel"/>
+    <w:tmpl w:val="9BD495D0"/>
+    <w:lvl w:ilvl="0">
+      <w:start w:val="1"/>
+      <w:numFmt w:val="decimal"/>
+      <w:lvlText w:val="%1."/>
+      <w:lvlJc w:val="left"/>
+      <w:pPr>
+        <w:tabs>
+          <w:tab w:val="num" w:pos="720"/>
+        </w:tabs>
+        <w:ind w:left="720" w:hanging="360"/>
+      </w:pPr>
+    </w:lvl>
+    <w:lvl w:ilvl="1" w:tentative="1">
+      <w:start w:val="1"/>
+      <w:numFmt w:val="decimal"/>
+      <w:lvlText w:val="%2."/>
+      <w:lvlJc w:val="left"/>
+      <w:pPr>
+        <w:tabs>
+          <w:tab w:val="num" w:pos="1440"/>
+        </w:tabs>
+        <w:ind w:left="1440" w:hanging="360"/>
+      </w:pPr>
+    </w:lvl>
+    <w:lvl w:ilvl="2" w:tentative="1">
+      <w:start w:val="1"/>
+      <w:numFmt w:val="decimal"/>
+      <w:lvlText w:val="%3."/>
+      <w:lvlJc w:val="left"/>
+      <w:pPr>
+        <w:tabs>
+          <w:tab w:val="num" w:pos="2160"/>
+        </w:tabs>
+        <w:ind w:left="2160" w:hanging="360"/>
+      </w:pPr>
+    </w:lvl>
+    <w:lvl w:ilvl="3" w:tentative="1">
+      <w:start w:val="1"/>
+      <w:numFmt w:val="decimal"/>
+      <w:lvlText w:val="%4."/>
+      <w:lvlJc w:val="left"/>
+      <w:pPr>
+        <w:tabs>
+          <w:tab w:val="num" w:pos="2880"/>
+        </w:tabs>
+        <w:ind w:left="2880" w:hanging="360"/>
+      </w:pPr>
+    </w:lvl>
+    <w:lvl w:ilvl="4" w:tentative="1">
+      <w:start w:val="1"/>
+      <w:numFmt w:val="decimal"/>
+      <w:lvlText w:val="%5."/>
+      <w:lvlJc w:val="left"/>
+      <w:pPr>
+        <w:tabs>
+          <w:tab w:val="num" w:pos="3600"/>
+        </w:tabs>
+        <w:ind w:left="3600" w:hanging="360"/>
+      </w:pPr>
+    </w:lvl>
+    <w:lvl w:ilvl="5" w:tentative="1">
+      <w:start w:val="1"/>
+      <w:numFmt w:val="decimal"/>
+      <w:lvlText w:val="%6."/>
+      <w:lvlJc w:val="left"/>
+      <w:pPr>
+        <w:tabs>
+          <w:tab w:val="num" w:pos="4320"/>
+        </w:tabs>
+        <w:ind w:left="4320" w:hanging="360"/>
+      </w:pPr>
+    </w:lvl>
+    <w:lvl w:ilvl="6" w:tentative="1">
+      <w:start w:val="1"/>
+      <w:numFmt w:val="decimal"/>
+      <w:lvlText w:val="%7."/>
+      <w:lvlJc w:val="left"/>
+      <w:pPr>
+        <w:tabs>
+          <w:tab w:val="num" w:pos="5040"/>
+        </w:tabs>
+        <w:ind w:left="5040" w:hanging="360"/>
+      </w:pPr>
+    </w:lvl>
+    <w:lvl w:ilvl="7" w:tentative="1">
+      <w:start w:val="1"/>
+      <w:numFmt w:val="decimal"/>
+      <w:lvlText w:val="%8."/>
+      <w:lvlJc w:val="left"/>
+      <w:pPr>
+        <w:tabs>
+          <w:tab w:val="num" w:pos="5760"/>
+        </w:tabs>
+        <w:ind w:left="5760" w:hanging="360"/>
+      </w:pPr>
+    </w:lvl>
+    <w:lvl w:ilvl="8" w:tentative="1">
+      <w:start w:val="1"/>
+      <w:numFmt w:val="decimal"/>
+      <w:lvlText w:val="%9."/>
+      <w:lvlJc w:val="left"/>
+      <w:pPr>
+        <w:tabs>
+          <w:tab w:val="num" w:pos="6480"/>
+        </w:tabs>
+        <w:ind w:left="6480" w:hanging="360"/>
+      </w:pPr>
+    </w:lvl>
+  </w:abstractNum>
+  <w:abstractNum w:abstractNumId="1" w15:restartNumberingAfterBreak="0">
+    <w:nsid w:val="0403280A"/>
+    <w:multiLevelType w:val="multilevel"/>
+    <w:tmpl w:val="87D0B0AC"/>
+    <w:lvl w:ilvl="0">
+      <w:start w:val="1"/>
+      <w:numFmt w:val="decimal"/>
+      <w:lvlText w:val="%1."/>
+      <w:lvlJc w:val="left"/>
+      <w:pPr>
+        <w:tabs>
+          <w:tab w:val="num" w:pos="720"/>
+        </w:tabs>
+        <w:ind w:left="720" w:hanging="360"/>
+      </w:pPr>
+    </w:lvl>
+    <w:lvl w:ilvl="1" w:tentative="1">
+      <w:start w:val="1"/>
+      <w:numFmt w:val="decimal"/>
+      <w:lvlText w:val="%2."/>
+      <w:lvlJc w:val="left"/>
+      <w:pPr>
+        <w:tabs>
+          <w:tab w:val="num" w:pos="1440"/>
+        </w:tabs>
+        <w:ind w:left="1440" w:hanging="360"/>
+      </w:pPr>
+    </w:lvl>
+    <w:lvl w:ilvl="2" w:tentative="1">
+      <w:start w:val="1"/>
+      <w:numFmt w:val="decimal"/>
+      <w:lvlText w:val="%3."/>
+      <w:lvlJc w:val="left"/>
+      <w:pPr>
+        <w:tabs>
+          <w:tab w:val="num" w:pos="2160"/>
+        </w:tabs>
+        <w:ind w:left="2160" w:hanging="360"/>
+      </w:pPr>
+    </w:lvl>
+    <w:lvl w:ilvl="3" w:tentative="1">
+      <w:start w:val="1"/>
+      <w:numFmt w:val="decimal"/>
+      <w:lvlText w:val="%4."/>
+      <w:lvlJc w:val="left"/>
+      <w:pPr>
+        <w:tabs>
+          <w:tab w:val="num" w:pos="2880"/>
+        </w:tabs>
+        <w:ind w:left="2880" w:hanging="360"/>
+      </w:pPr>
+    </w:lvl>
+    <w:lvl w:ilvl="4" w:tentative="1">
+      <w:start w:val="1"/>
+      <w:numFmt w:val="decimal"/>
+      <w:lvlText w:val="%5."/>
+      <w:lvlJc w:val="left"/>
+      <w:pPr>
+        <w:tabs>
+          <w:tab w:val="num" w:pos="3600"/>
+        </w:tabs>
+        <w:ind w:left="3600" w:hanging="360"/>
+      </w:pPr>
+    </w:lvl>
+    <w:lvl w:ilvl="5" w:tentative="1">
+      <w:start w:val="1"/>
+      <w:numFmt w:val="decimal"/>
+      <w:lvlText w:val="%6."/>
+      <w:lvlJc w:val="left"/>
+      <w:pPr>
+        <w:tabs>
+          <w:tab w:val="num" w:pos="4320"/>
+        </w:tabs>
+        <w:ind w:left="4320" w:hanging="360"/>
+      </w:pPr>
+    </w:lvl>
+    <w:lvl w:ilvl="6" w:tentative="1">
+      <w:start w:val="1"/>
+      <w:numFmt w:val="decimal"/>
+      <w:lvlText w:val="%7."/>
+      <w:lvlJc w:val="left"/>
+      <w:pPr>
+        <w:tabs>
+          <w:tab w:val="num" w:pos="5040"/>
+        </w:tabs>
+        <w:ind w:left="5040" w:hanging="360"/>
+      </w:pPr>
+    </w:lvl>
+    <w:lvl w:ilvl="7" w:tentative="1">
+      <w:start w:val="1"/>
+      <w:numFmt w:val="decimal"/>
+      <w:lvlText w:val="%8."/>
+      <w:lvlJc w:val="left"/>
+      <w:pPr>
+        <w:tabs>
+          <w:tab w:val="num" w:pos="5760"/>
+        </w:tabs>
+        <w:ind w:left="5760" w:hanging="360"/>
+      </w:pPr>
+    </w:lvl>
+    <w:lvl w:ilvl="8" w:tentative="1">
+      <w:start w:val="1"/>
+      <w:numFmt w:val="decimal"/>
+      <w:lvlText w:val="%9."/>
+      <w:lvlJc w:val="left"/>
+      <w:pPr>
+        <w:tabs>
+          <w:tab w:val="num" w:pos="6480"/>
+        </w:tabs>
+        <w:ind w:left="6480" w:hanging="360"/>
+      </w:pPr>
+    </w:lvl>
+  </w:abstractNum>
+  <w:abstractNum w:abstractNumId="2" w15:restartNumberingAfterBreak="0">
     <w:nsid w:val="14E36E18"/>
     <w:multiLevelType w:val="multilevel"/>
     <w:tmpl w:val="AC640442"/>
@@ -4480,7 +7575,7 @@
       </w:rPr>
     </w:lvl>
   </w:abstractNum>
-  <w:abstractNum w:abstractNumId="1" w15:restartNumberingAfterBreak="0">
+  <w:abstractNum w:abstractNumId="3" w15:restartNumberingAfterBreak="0">
     <w:nsid w:val="15DD6685"/>
     <w:multiLevelType w:val="multilevel"/>
     <w:tmpl w:val="AB8C96FA"/>
@@ -4629,7 +7724,7 @@
       </w:rPr>
     </w:lvl>
   </w:abstractNum>
-  <w:abstractNum w:abstractNumId="2" w15:restartNumberingAfterBreak="0">
+  <w:abstractNum w:abstractNumId="4" w15:restartNumberingAfterBreak="0">
     <w:nsid w:val="219056BF"/>
     <w:multiLevelType w:val="multilevel"/>
     <w:tmpl w:val="6314956E"/>
@@ -4778,7 +7873,7 @@
       </w:rPr>
     </w:lvl>
   </w:abstractNum>
-  <w:abstractNum w:abstractNumId="3" w15:restartNumberingAfterBreak="0">
+  <w:abstractNum w:abstractNumId="5" w15:restartNumberingAfterBreak="0">
     <w:nsid w:val="307358D3"/>
     <w:multiLevelType w:val="multilevel"/>
     <w:tmpl w:val="A5948BA0"/>
@@ -4927,7 +8022,7 @@
       </w:rPr>
     </w:lvl>
   </w:abstractNum>
-  <w:abstractNum w:abstractNumId="4" w15:restartNumberingAfterBreak="0">
+  <w:abstractNum w:abstractNumId="6" w15:restartNumberingAfterBreak="0">
     <w:nsid w:val="313D2098"/>
     <w:multiLevelType w:val="multilevel"/>
     <w:tmpl w:val="5B7C3366"/>
@@ -5076,7 +8171,7 @@
       </w:rPr>
     </w:lvl>
   </w:abstractNum>
-  <w:abstractNum w:abstractNumId="5" w15:restartNumberingAfterBreak="0">
+  <w:abstractNum w:abstractNumId="7" w15:restartNumberingAfterBreak="0">
     <w:nsid w:val="43D2211E"/>
     <w:multiLevelType w:val="multilevel"/>
     <w:tmpl w:val="8500DF04"/>
@@ -5225,7 +8320,7 @@
       </w:rPr>
     </w:lvl>
   </w:abstractNum>
-  <w:abstractNum w:abstractNumId="6" w15:restartNumberingAfterBreak="0">
+  <w:abstractNum w:abstractNumId="8" w15:restartNumberingAfterBreak="0">
     <w:nsid w:val="45661E5D"/>
     <w:multiLevelType w:val="multilevel"/>
     <w:tmpl w:val="0952FF10"/>
@@ -5374,7 +8469,7 @@
       </w:rPr>
     </w:lvl>
   </w:abstractNum>
-  <w:abstractNum w:abstractNumId="7" w15:restartNumberingAfterBreak="0">
+  <w:abstractNum w:abstractNumId="9" w15:restartNumberingAfterBreak="0">
     <w:nsid w:val="4A3D40F8"/>
     <w:multiLevelType w:val="multilevel"/>
     <w:tmpl w:val="6DEC5F0E"/>
@@ -5523,7 +8618,7 @@
       </w:rPr>
     </w:lvl>
   </w:abstractNum>
-  <w:abstractNum w:abstractNumId="8" w15:restartNumberingAfterBreak="0">
+  <w:abstractNum w:abstractNumId="10" w15:restartNumberingAfterBreak="0">
     <w:nsid w:val="4B0F3655"/>
     <w:multiLevelType w:val="multilevel"/>
     <w:tmpl w:val="35A8F152"/>
@@ -5640,7 +8735,7 @@
       </w:pPr>
     </w:lvl>
   </w:abstractNum>
-  <w:abstractNum w:abstractNumId="9" w15:restartNumberingAfterBreak="0">
+  <w:abstractNum w:abstractNumId="11" w15:restartNumberingAfterBreak="0">
     <w:nsid w:val="5E7449F2"/>
     <w:multiLevelType w:val="multilevel"/>
     <w:tmpl w:val="2BEA33E8"/>
@@ -5789,7 +8884,7 @@
       </w:rPr>
     </w:lvl>
   </w:abstractNum>
-  <w:abstractNum w:abstractNumId="10" w15:restartNumberingAfterBreak="0">
+  <w:abstractNum w:abstractNumId="12" w15:restartNumberingAfterBreak="0">
     <w:nsid w:val="623607B1"/>
     <w:multiLevelType w:val="multilevel"/>
     <w:tmpl w:val="658E4E1A"/>
@@ -5938,7 +9033,7 @@
       </w:rPr>
     </w:lvl>
   </w:abstractNum>
-  <w:abstractNum w:abstractNumId="11" w15:restartNumberingAfterBreak="0">
+  <w:abstractNum w:abstractNumId="13" w15:restartNumberingAfterBreak="0">
     <w:nsid w:val="6E1B6361"/>
     <w:multiLevelType w:val="multilevel"/>
     <w:tmpl w:val="838CF706"/>
@@ -6088,40 +9183,46 @@
     </w:lvl>
   </w:abstractNum>
   <w:num w:numId="1" w16cid:durableId="1366828582">
+    <w:abstractNumId w:val="12"/>
+  </w:num>
+  <w:num w:numId="2" w16cid:durableId="753551230">
+    <w:abstractNumId w:val="7"/>
+  </w:num>
+  <w:num w:numId="3" w16cid:durableId="1374696448">
+    <w:abstractNumId w:val="11"/>
+  </w:num>
+  <w:num w:numId="4" w16cid:durableId="771390619">
+    <w:abstractNumId w:val="3"/>
+  </w:num>
+  <w:num w:numId="5" w16cid:durableId="1232346572">
+    <w:abstractNumId w:val="2"/>
+  </w:num>
+  <w:num w:numId="6" w16cid:durableId="1314525439">
     <w:abstractNumId w:val="10"/>
   </w:num>
-  <w:num w:numId="2" w16cid:durableId="753551230">
+  <w:num w:numId="7" w16cid:durableId="295066878">
+    <w:abstractNumId w:val="6"/>
+  </w:num>
+  <w:num w:numId="8" w16cid:durableId="1494950534">
+    <w:abstractNumId w:val="8"/>
+  </w:num>
+  <w:num w:numId="9" w16cid:durableId="14693943">
     <w:abstractNumId w:val="5"/>
   </w:num>
-  <w:num w:numId="3" w16cid:durableId="1374696448">
+  <w:num w:numId="10" w16cid:durableId="363020050">
+    <w:abstractNumId w:val="4"/>
+  </w:num>
+  <w:num w:numId="11" w16cid:durableId="11417353">
     <w:abstractNumId w:val="9"/>
   </w:num>
-  <w:num w:numId="4" w16cid:durableId="771390619">
+  <w:num w:numId="12" w16cid:durableId="333000322">
+    <w:abstractNumId w:val="13"/>
+  </w:num>
+  <w:num w:numId="13" w16cid:durableId="476066547">
     <w:abstractNumId w:val="1"/>
   </w:num>
-  <w:num w:numId="5" w16cid:durableId="1232346572">
+  <w:num w:numId="14" w16cid:durableId="1936356746">
     <w:abstractNumId w:val="0"/>
-  </w:num>
-  <w:num w:numId="6" w16cid:durableId="1314525439">
-    <w:abstractNumId w:val="8"/>
-  </w:num>
-  <w:num w:numId="7" w16cid:durableId="295066878">
-    <w:abstractNumId w:val="4"/>
-  </w:num>
-  <w:num w:numId="8" w16cid:durableId="1494950534">
-    <w:abstractNumId w:val="6"/>
-  </w:num>
-  <w:num w:numId="9" w16cid:durableId="14693943">
-    <w:abstractNumId w:val="3"/>
-  </w:num>
-  <w:num w:numId="10" w16cid:durableId="363020050">
-    <w:abstractNumId w:val="2"/>
-  </w:num>
-  <w:num w:numId="11" w16cid:durableId="11417353">
-    <w:abstractNumId w:val="7"/>
-  </w:num>
-  <w:num w:numId="12" w16cid:durableId="333000322">
-    <w:abstractNumId w:val="11"/>
   </w:num>
 </w:numbering>
 </file>
@@ -6577,7 +9678,6 @@
     <w:next w:val="Normal"/>
     <w:link w:val="Ttulo3Car"/>
     <w:uiPriority w:val="9"/>
-    <w:semiHidden/>
     <w:unhideWhenUsed/>
     <w:qFormat/>
     <w:rsid w:val="00A26149"/>
@@ -6784,7 +9884,6 @@
     <w:basedOn w:val="Fuentedeprrafopredeter"/>
     <w:link w:val="Ttulo3"/>
     <w:uiPriority w:val="9"/>
-    <w:semiHidden/>
     <w:rsid w:val="00A26149"/>
     <w:rPr>
       <w:rFonts w:eastAsiaTheme="majorEastAsia" w:cstheme="majorBidi"/>
@@ -7052,6 +10151,55 @@
     <w:rPr>
       <w:rFonts w:ascii="Times New Roman" w:hAnsi="Times New Roman" w:cs="Times New Roman"/>
     </w:rPr>
+  </w:style>
+  <w:style w:type="character" w:customStyle="1" w:styleId="ng-tns-c2848597339-70">
+    <w:name w:val="ng-tns-c2848597339-70"/>
+    <w:basedOn w:val="Fuentedeprrafopredeter"/>
+    <w:rsid w:val="00D96FD9"/>
+  </w:style>
+  <w:style w:type="paragraph" w:styleId="Encabezado">
+    <w:name w:val="header"/>
+    <w:basedOn w:val="Normal"/>
+    <w:link w:val="EncabezadoCar"/>
+    <w:uiPriority w:val="99"/>
+    <w:unhideWhenUsed/>
+    <w:rsid w:val="00191724"/>
+    <w:pPr>
+      <w:tabs>
+        <w:tab w:val="center" w:pos="4419"/>
+        <w:tab w:val="right" w:pos="8838"/>
+      </w:tabs>
+      <w:spacing w:after="0" w:line="240" w:lineRule="auto"/>
+    </w:pPr>
+  </w:style>
+  <w:style w:type="character" w:customStyle="1" w:styleId="EncabezadoCar">
+    <w:name w:val="Encabezado Car"/>
+    <w:basedOn w:val="Fuentedeprrafopredeter"/>
+    <w:link w:val="Encabezado"/>
+    <w:uiPriority w:val="99"/>
+    <w:rsid w:val="00191724"/>
+  </w:style>
+  <w:style w:type="paragraph" w:styleId="Piedepgina">
+    <w:name w:val="footer"/>
+    <w:basedOn w:val="Normal"/>
+    <w:link w:val="PiedepginaCar"/>
+    <w:uiPriority w:val="99"/>
+    <w:unhideWhenUsed/>
+    <w:rsid w:val="00191724"/>
+    <w:pPr>
+      <w:tabs>
+        <w:tab w:val="center" w:pos="4419"/>
+        <w:tab w:val="right" w:pos="8838"/>
+      </w:tabs>
+      <w:spacing w:after="0" w:line="240" w:lineRule="auto"/>
+    </w:pPr>
+  </w:style>
+  <w:style w:type="character" w:customStyle="1" w:styleId="PiedepginaCar">
+    <w:name w:val="Pie de página Car"/>
+    <w:basedOn w:val="Fuentedeprrafopredeter"/>
+    <w:link w:val="Piedepgina"/>
+    <w:uiPriority w:val="99"/>
+    <w:rsid w:val="00191724"/>
   </w:style>
 </w:styles>
 </file>

</xml_diff>